<commit_message>
Documentation for 0.3.0: What's shipped, owner decisions, every guide current
README: status and counts (1,149 tests; 92.9% coverage; 178 endpoints); a
new "What's shipped" section of 41 rows mapping each capability to where it
lives and the tests that prove it, with what the plan promised and did not
deliver; "Out of scope by decision" for the live Claude API, Windows and
macOS, and a dedicated benchmark host; "Not yet" rewritten.

The implementation plan carries a status-at-0.3.0 note on every milestone,
the changelog covers OIDC logout and the TSA check, the benchmark report
records the dedicated-host decision, the specification gains three revision
2.3 markers (the principal cache in §12, materialize_policy in D-1, the
header), and its .docx/.pdf are rebuilt. Guides and help topics cover OIDC
logout both ways, the TSA CA check and materialization; the About page's
stale "Honest limits" is rewritten. The About highlights for 0.3.0 name the
OIDC logout and the TSA check.
</commit_message>
<xml_diff>
--- a/docs/MAYA_Requirements_and_Design.docx
+++ b/docs/MAYA_Requirements_and_Design.docx
@@ -124,7 +124,37 @@
         <w:t xml:space="preserve"> </w:t>
       </w:r>
       <w:r>
-        <w:t xml:space="preserve">IdP’s logout request accepted only when signed (§12).</w:t>
+        <w:t xml:space="preserve">IdP’s logout request accepted only when signed (§12). Two more, from version 0.3, are</w:t>
+      </w:r>
+      <w:r>
+        <w:t xml:space="preserve"> </w:t>
+      </w:r>
+      <w:r>
+        <w:t xml:space="preserve">marked the same way: feature-set pin materialization is the namespace’s</w:t>
+      </w:r>
+      <w:r>
+        <w:t xml:space="preserve"> </w:t>
+      </w:r>
+      <w:r>
+        <w:rPr>
+          <w:rStyle w:val="VerbatimChar"/>
+        </w:rPr>
+        <w:t xml:space="preserve">materialize_policy</w:t>
+      </w:r>
+      <w:r>
+        <w:t xml:space="preserve">, and a pin not written is sealed by hash and replayed (§6.6,</w:t>
+      </w:r>
+      <w:r>
+        <w:t xml:space="preserve"> </w:t>
+      </w:r>
+      <w:r>
+        <w:t xml:space="preserve">§26.3); and a signed-in session’s principal is reused for up to two seconds, so a</w:t>
+      </w:r>
+      <w:r>
+        <w:t xml:space="preserve"> </w:t>
+      </w:r>
+      <w:r>
+        <w:t xml:space="preserve">session ended in another web process can outlive its end by that long (§12).</w:t>
       </w:r>
     </w:p>
     <w:p>
@@ -18062,7 +18092,38 @@
         <w:t xml:space="preserve"> </w:t>
       </w:r>
       <w:r>
-        <w:t xml:space="preserve">The UI authenticates people, not machines: at login MAYA issues a short-lived token bound to the server-side session, carrying the user’s own roles and grants and no more, silently refreshed while the session lives and dead the moment the session ends. The web tier holds no shared key, and an audit entry raised through it names the human as actor with the channel recorded as</w:t>
+        <w:t xml:space="preserve">The UI authenticates people, not machines: at login MAYA issues a short-lived token bound to the server-side session, carrying the user’s own roles and grants and no more, silently refreshed while the session lives and dead the moment the session ends.</w:t>
+      </w:r>
+      <w:r>
+        <w:t xml:space="preserve"> </w:t>
+      </w:r>
+      <w:r>
+        <w:rPr>
+          <w:i/>
+          <w:iCs/>
+        </w:rPr>
+        <w:t xml:space="preserve">Revision 2.3:</w:t>
+      </w:r>
+      <w:r>
+        <w:t xml:space="preserve"> </w:t>
+      </w:r>
+      <w:r>
+        <w:t xml:space="preserve">one page makes several internal calls, so a fully signed-in session’s principal is reused for</w:t>
+      </w:r>
+      <w:r>
+        <w:t xml:space="preserve"> </w:t>
+      </w:r>
+      <w:r>
+        <w:rPr>
+          <w:rStyle w:val="VerbatimChar"/>
+        </w:rPr>
+        <w:t xml:space="preserve">auth.session.principal_cache_seconds</w:t>
+      </w:r>
+      <w:r>
+        <w:t xml:space="preserve"> </w:t>
+      </w:r>
+      <w:r>
+        <w:t xml:space="preserve">(default 2; 0 turns it off). A sign-out, revocation or access change applies at once in the web process that made it, and at most that many seconds late in any other; a session still owing a second factor is never reused. Before, the home page resolved the same session six times. The window is accepted deliberately, as the price of that, and is the one place a session outlives its end. The web tier holds no shared key, and an audit entry raised through it names the human as actor with the channel recorded as</w:t>
       </w:r>
       <w:r>
         <w:t xml:space="preserve"> </w:t>
@@ -36382,7 +36443,65 @@
               <w:t xml:space="preserve"> </w:t>
             </w:r>
             <w:r>
-              <w:t xml:space="preserve">(§6.6)</w:t>
+              <w:t xml:space="preserve">(§6.6).</w:t>
+            </w:r>
+            <w:r>
+              <w:t xml:space="preserve"> </w:t>
+            </w:r>
+            <w:r>
+              <w:rPr>
+                <w:i/>
+                <w:iCs/>
+              </w:rPr>
+              <w:t xml:space="preserve">Revision 2.3:</w:t>
+            </w:r>
+            <w:r>
+              <w:t xml:space="preserve"> </w:t>
+            </w:r>
+            <w:r>
+              <w:t xml:space="preserve">the setting is the namespace’s</w:t>
+            </w:r>
+            <w:r>
+              <w:t xml:space="preserve"> </w:t>
+            </w:r>
+            <w:r>
+              <w:rPr>
+                <w:rStyle w:val="VerbatimChar"/>
+              </w:rPr>
+              <w:t xml:space="preserve">materialize_policy</w:t>
+            </w:r>
+            <w:r>
+              <w:t xml:space="preserve">;</w:t>
+            </w:r>
+            <w:r>
+              <w:t xml:space="preserve"> </w:t>
+            </w:r>
+            <w:r>
+              <w:rPr>
+                <w:rStyle w:val="VerbatimChar"/>
+              </w:rPr>
+              <w:t xml:space="preserve">on_demand</w:t>
+            </w:r>
+            <w:r>
+              <w:t xml:space="preserve"> </w:t>
+            </w:r>
+            <w:r>
+              <w:t xml:space="preserve">and</w:t>
+            </w:r>
+            <w:r>
+              <w:t xml:space="preserve"> </w:t>
+            </w:r>
+            <w:r>
+              <w:rPr>
+                <w:rStyle w:val="VerbatimChar"/>
+              </w:rPr>
+              <w:t xml:space="preserve">never</w:t>
+            </w:r>
+            <w:r>
+              <w:t xml:space="preserve"> </w:t>
+            </w:r>
+            <w:r>
+              <w:t xml:space="preserve">seal by hash and replay from the member pins (§6.6)</w:t>
             </w:r>
           </w:p>
         </w:tc>

</xml_diff>

<commit_message>
Refresh the generated documents, and make the benchmark evidence findable
Nothing in docs/ predates the rebuild - every file is from this build - but four
generated artefacts had fallen behind their sources:
- the specification's .docx and .pdf were rebuilt before the later Revision 2.4
  markers, so they carried 11 of 16;
- the executive deck said "more than 1,200 tests" (now more than 1,500);
- the paper said 54 schema tables (now 56, after the restore-drill and
  access-request tables).

Also: the README's test count and endpoint count were a wave behind (1,270 ->
1,539 collected, 179 -> 203 endpoints); BENCHMARKS.md linked the result folder but
never said which file held which number, so every published figure now names its
evidence; and the plan's M8 note points at the specification audit, since the
milestones are not the whole specification and the audit is what is left.
</commit_message>
<xml_diff>
--- a/docs/MAYA_Requirements_and_Design.docx
+++ b/docs/MAYA_Requirements_and_Design.docx
@@ -156,7 +156,52 @@
         <w:t xml:space="preserve"> </w:t>
       </w:r>
       <w:r>
-        <w:t xml:space="preserve">Revision 2.2’s summary below called that index a scan.</w:t>
+        <w:t xml:space="preserve">Revision 2.2’s summary below called that index a scan. Two more, from closing those</w:t>
+      </w:r>
+      <w:r>
+        <w:t xml:space="preserve"> </w:t>
+      </w:r>
+      <w:r>
+        <w:t xml:space="preserve">gaps: §10.2’s example asked the model owner to approve while §11’s matrix gave that role</w:t>
+      </w:r>
+      <w:r>
+        <w:t xml:space="preserve"> </w:t>
+      </w:r>
+      <w:r>
+        <w:t xml:space="preserve">no approval capability, so a production namespace could approve no execution warrant at</w:t>
+      </w:r>
+      <w:r>
+        <w:t xml:space="preserve"> </w:t>
+      </w:r>
+      <w:r>
+        <w:t xml:space="preserve">all — the matrix now grants it (§11, §3); and</w:t>
+      </w:r>
+      <w:r>
+        <w:t xml:space="preserve"> </w:t>
+      </w:r>
+      <w:r>
+        <w:rPr>
+          <w:rStyle w:val="VerbatimChar"/>
+        </w:rPr>
+        <w:t xml:space="preserve">namespace_read</w:t>
+      </w:r>
+      <w:r>
+        <w:t xml:space="preserve"> </w:t>
+      </w:r>
+      <w:r>
+        <w:t xml:space="preserve">behaved exactly like</w:t>
+      </w:r>
+      <w:r>
+        <w:t xml:space="preserve"> </w:t>
+      </w:r>
+      <w:r>
+        <w:rPr>
+          <w:rStyle w:val="VerbatimChar"/>
+        </w:rPr>
+        <w:t xml:space="preserve">public_read</w:t>
+      </w:r>
+      <w:r>
+        <w:t xml:space="preserve">, so §11.1 now says who a namespace’s people are.</w:t>
       </w:r>
     </w:p>
     <w:p>
@@ -9417,6 +9462,249 @@
       </w:pPr>
       <w:r>
         <w:rPr>
+          <w:i/>
+          <w:iCs/>
+        </w:rPr>
+        <w:t xml:space="preserve">Revision 2.4:</w:t>
+      </w:r>
+      <w:r>
+        <w:t xml:space="preserve"> </w:t>
+      </w:r>
+      <w:r>
+        <w:t xml:space="preserve">every operator above is built. A set that is an operation over other sets</w:t>
+      </w:r>
+      <w:r>
+        <w:t xml:space="preserve"> </w:t>
+      </w:r>
+      <w:r>
+        <w:t xml:space="preserve">carries a</w:t>
+      </w:r>
+      <w:r>
+        <w:t xml:space="preserve"> </w:t>
+      </w:r>
+      <w:r>
+        <w:rPr>
+          <w:rStyle w:val="VerbatimChar"/>
+        </w:rPr>
+        <w:t xml:space="preserve">derivation</w:t>
+      </w:r>
+      <w:r>
+        <w:t xml:space="preserve"> </w:t>
+      </w:r>
+      <w:r>
+        <w:t xml:space="preserve">block —</w:t>
+      </w:r>
+      <w:r>
+        <w:t xml:space="preserve"> </w:t>
+      </w:r>
+      <w:r>
+        <w:rPr>
+          <w:rStyle w:val="VerbatimChar"/>
+        </w:rPr>
+        <w:t xml:space="preserve">{operator, operands, options}</w:t>
+      </w:r>
+      <w:r>
+        <w:t xml:space="preserve"> </w:t>
+      </w:r>
+      <w:r>
+        <w:t xml:space="preserve">— instead of</w:t>
+      </w:r>
+      <w:r>
+        <w:t xml:space="preserve"> </w:t>
+      </w:r>
+      <w:r>
+        <w:rPr>
+          <w:rStyle w:val="VerbatimChar"/>
+        </w:rPr>
+        <w:t xml:space="preserve">members</w:t>
+      </w:r>
+      <w:r>
+        <w:t xml:space="preserve">, and</w:t>
+      </w:r>
+      <w:r>
+        <w:t xml:space="preserve"> </w:t>
+      </w:r>
+      <w:r>
+        <w:t xml:space="preserve">resolves by resolving its operands and applying the operator;</w:t>
+      </w:r>
+      <w:r>
+        <w:t xml:space="preserve"> </w:t>
+      </w:r>
+      <w:r>
+        <w:rPr>
+          <w:rStyle w:val="VerbatimChar"/>
+        </w:rPr>
+        <w:t xml:space="preserve">union</w:t>
+      </w:r>
+      <w:r>
+        <w:t xml:space="preserve">,</w:t>
+      </w:r>
+      <w:r>
+        <w:t xml:space="preserve"> </w:t>
+      </w:r>
+      <w:r>
+        <w:rPr>
+          <w:rStyle w:val="VerbatimChar"/>
+        </w:rPr>
+        <w:t xml:space="preserve">intersect</w:t>
+      </w:r>
+      <w:r>
+        <w:t xml:space="preserve">,</w:t>
+      </w:r>
+      <w:r>
+        <w:t xml:space="preserve"> </w:t>
+      </w:r>
+      <w:r>
+        <w:rPr>
+          <w:rStyle w:val="VerbatimChar"/>
+        </w:rPr>
+        <w:t xml:space="preserve">difference</w:t>
+      </w:r>
+      <w:r>
+        <w:t xml:space="preserve">,</w:t>
+      </w:r>
+      <w:r>
+        <w:t xml:space="preserve"> </w:t>
+      </w:r>
+      <w:r>
+        <w:rPr>
+          <w:rStyle w:val="VerbatimChar"/>
+        </w:rPr>
+        <w:t xml:space="preserve">join</w:t>
+      </w:r>
+      <w:r>
+        <w:t xml:space="preserve"> </w:t>
+      </w:r>
+      <w:r>
+        <w:t xml:space="preserve">(§6.2’s alignment modes),</w:t>
+      </w:r>
+      <w:r>
+        <w:t xml:space="preserve"> </w:t>
+      </w:r>
+      <w:r>
+        <w:rPr>
+          <w:rStyle w:val="VerbatimChar"/>
+        </w:rPr>
+        <w:t xml:space="preserve">project</w:t>
+      </w:r>
+      <w:r>
+        <w:t xml:space="preserve">,</w:t>
+      </w:r>
+      <w:r>
+        <w:t xml:space="preserve"> </w:t>
+      </w:r>
+      <w:r>
+        <w:rPr>
+          <w:rStyle w:val="VerbatimChar"/>
+        </w:rPr>
+        <w:t xml:space="preserve">pivot</w:t>
+      </w:r>
+      <w:r>
+        <w:t xml:space="preserve">,</w:t>
+      </w:r>
+      <w:r>
+        <w:t xml:space="preserve"> </w:t>
+      </w:r>
+      <w:r>
+        <w:rPr>
+          <w:rStyle w:val="VerbatimChar"/>
+        </w:rPr>
+        <w:t xml:space="preserve">unpivot</w:t>
+      </w:r>
+      <w:r>
+        <w:t xml:space="preserve"> </w:t>
+      </w:r>
+      <w:r>
+        <w:t xml:space="preserve">and</w:t>
+      </w:r>
+      <w:r>
+        <w:t xml:space="preserve"> </w:t>
+      </w:r>
+      <w:r>
+        <w:rPr>
+          <w:rStyle w:val="VerbatimChar"/>
+        </w:rPr>
+        <w:t xml:space="preserve">sample</w:t>
+      </w:r>
+      <w:r>
+        <w:t xml:space="preserve"> </w:t>
+      </w:r>
+      <w:r>
+        <w:t xml:space="preserve">are the feature algebra’s own executors, so a set operation and the equivalent feature</w:t>
+      </w:r>
+      <w:r>
+        <w:t xml:space="preserve"> </w:t>
+      </w:r>
+      <w:r>
+        <w:t xml:space="preserve">operation cannot drift apart.</w:t>
+      </w:r>
+      <w:r>
+        <w:t xml:space="preserve"> </w:t>
+      </w:r>
+      <w:r>
+        <w:rPr>
+          <w:rStyle w:val="VerbatimChar"/>
+        </w:rPr>
+        <w:t xml:space="preserve">override</w:t>
+      </w:r>
+      <w:r>
+        <w:t xml:space="preserve"> </w:t>
+      </w:r>
+      <w:r>
+        <w:t xml:space="preserve">re-resolves one operand under a replaced policy,</w:t>
+      </w:r>
+      <w:r>
+        <w:t xml:space="preserve"> </w:t>
+      </w:r>
+      <w:r>
+        <w:t xml:space="preserve">filter, grid or alignment.</w:t>
+      </w:r>
+      <w:r>
+        <w:t xml:space="preserve"> </w:t>
+      </w:r>
+      <w:r>
+        <w:rPr>
+          <w:rStyle w:val="VerbatimChar"/>
+        </w:rPr>
+        <w:t xml:space="preserve">sample</w:t>
+      </w:r>
+      <w:r>
+        <w:t xml:space="preserve"> </w:t>
+      </w:r>
+      <w:r>
+        <w:t xml:space="preserve">is deterministic: a date range, a universe, or a</w:t>
+      </w:r>
+      <w:r>
+        <w:t xml:space="preserve"> </w:t>
+      </w:r>
+      <w:r>
+        <w:t xml:space="preserve">seeded fraction chosen by hashing each row’s index, so the same spec keeps the same rows</w:t>
+      </w:r>
+      <w:r>
+        <w:t xml:space="preserve"> </w:t>
+      </w:r>
+      <w:r>
+        <w:t xml:space="preserve">on any machine. A derived set pins only over operands that are themselves pinned, and</w:t>
+      </w:r>
+      <w:r>
+        <w:t xml:space="preserve"> </w:t>
+      </w:r>
+      <w:r>
+        <w:t xml:space="preserve">refuses by name otherwise — there is no cascade, because pinning somebody else’s feature</w:t>
+      </w:r>
+      <w:r>
+        <w:t xml:space="preserve"> </w:t>
+      </w:r>
+      <w:r>
+        <w:t xml:space="preserve">set is their decision.</w:t>
+      </w:r>
+    </w:p>
+    <w:p>
+      <w:pPr>
+        <w:pStyle w:val="BodyText"/>
+      </w:pPr>
+      <w:r>
+        <w:rPr>
           <w:b/>
           <w:bCs/>
         </w:rPr>
@@ -15469,6 +15757,12 @@
         <w:t xml:space="preserve">}],</w:t>
       </w:r>
       <w:r>
+        <w:rPr>
+          <w:rStyle w:val="CommentTok"/>
+        </w:rPr>
+        <w:t xml:space="preserve">   # Revision 2.4: the owner holds 'A' (§3)</w:t>
+      </w:r>
+      <w:r>
         <w:br/>
       </w:r>
       <w:r>
@@ -15802,6 +16096,159 @@
     <w:p>
       <w:pPr>
         <w:pStyle w:val="FirstParagraph"/>
+      </w:pPr>
+      <w:r>
+        <w:rPr>
+          <w:i/>
+          <w:iCs/>
+        </w:rPr>
+        <w:t xml:space="preserve">Revision 2.4:</w:t>
+      </w:r>
+      <w:r>
+        <w:t xml:space="preserve"> </w:t>
+      </w:r>
+      <w:r>
+        <w:t xml:space="preserve">an approval’s</w:t>
+      </w:r>
+      <w:r>
+        <w:t xml:space="preserve"> </w:t>
+      </w:r>
+      <w:r>
+        <w:rPr>
+          <w:rStyle w:val="VerbatimChar"/>
+        </w:rPr>
+        <w:t xml:space="preserve">when</w:t>
+      </w:r>
+      <w:r>
+        <w:t xml:space="preserve"> </w:t>
+      </w:r>
+      <w:r>
+        <w:t xml:space="preserve">is read, not guessed:</w:t>
+      </w:r>
+      <w:r>
+        <w:t xml:space="preserve"> </w:t>
+      </w:r>
+      <w:r>
+        <w:rPr>
+          <w:rStyle w:val="VerbatimChar"/>
+        </w:rPr>
+        <w:t xml:space="preserve">prod</w:t>
+      </w:r>
+      <w:r>
+        <w:t xml:space="preserve">,</w:t>
+      </w:r>
+      <w:r>
+        <w:t xml:space="preserve"> </w:t>
+      </w:r>
+      <w:r>
+        <w:rPr>
+          <w:rStyle w:val="VerbatimChar"/>
+        </w:rPr>
+        <w:t xml:space="preserve">env == 'prod'</w:t>
+      </w:r>
+      <w:r>
+        <w:t xml:space="preserve">,</w:t>
+      </w:r>
+      <w:r>
+        <w:t xml:space="preserve"> </w:t>
+      </w:r>
+      <w:r>
+        <w:rPr>
+          <w:rStyle w:val="VerbatimChar"/>
+        </w:rPr>
+        <w:t xml:space="preserve">env != 'prod'</w:t>
+      </w:r>
+      <w:r>
+        <w:t xml:space="preserve"> </w:t>
+      </w:r>
+      <w:r>
+        <w:t xml:space="preserve">and the</w:t>
+      </w:r>
+      <w:r>
+        <w:t xml:space="preserve"> </w:t>
+      </w:r>
+      <w:r>
+        <w:rPr>
+          <w:rStyle w:val="VerbatimChar"/>
+        </w:rPr>
+        <w:t xml:space="preserve">nonprod</w:t>
+      </w:r>
+      <w:r>
+        <w:t xml:space="preserve"> </w:t>
+      </w:r>
+      <w:r>
+        <w:t xml:space="preserve">forms. A namespace marked</w:t>
+      </w:r>
+      <w:r>
+        <w:t xml:space="preserve"> </w:t>
+      </w:r>
+      <w:r>
+        <w:rPr>
+          <w:rStyle w:val="VerbatimChar"/>
+        </w:rPr>
+        <w:t xml:space="preserve">production</w:t>
+      </w:r>
+      <w:r>
+        <w:t xml:space="preserve"> </w:t>
+      </w:r>
+      <w:r>
+        <w:t xml:space="preserve">is env</w:t>
+      </w:r>
+      <w:r>
+        <w:t xml:space="preserve"> </w:t>
+      </w:r>
+      <w:r>
+        <w:rPr>
+          <w:rStyle w:val="VerbatimChar"/>
+        </w:rPr>
+        <w:t xml:space="preserve">prod</w:t>
+      </w:r>
+      <w:r>
+        <w:t xml:space="preserve">.</w:t>
+      </w:r>
+      <w:r>
+        <w:t xml:space="preserve"> </w:t>
+      </w:r>
+      <w:r>
+        <w:t xml:space="preserve">Any other form is refused when the policy is saved, and a stored form MAYA cannot read</w:t>
+      </w:r>
+      <w:r>
+        <w:t xml:space="preserve"> </w:t>
+      </w:r>
+      <w:r>
+        <w:t xml:space="preserve">asks for the approval rather than dropping it — before this, every form but the bare word</w:t>
+      </w:r>
+      <w:r>
+        <w:t xml:space="preserve"> </w:t>
+      </w:r>
+      <w:r>
+        <w:rPr>
+          <w:rStyle w:val="VerbatimChar"/>
+        </w:rPr>
+        <w:t xml:space="preserve">prod</w:t>
+      </w:r>
+      <w:r>
+        <w:t xml:space="preserve"> </w:t>
+      </w:r>
+      <w:r>
+        <w:t xml:space="preserve">silently made the approval unconditional. A policy whose approver could never hold</w:t>
+      </w:r>
+      <w:r>
+        <w:t xml:space="preserve"> </w:t>
+      </w:r>
+      <w:r>
+        <w:t xml:space="preserve">the capability (§11’s ceiling) is also refused, rather than leaving its objects stuck in</w:t>
+      </w:r>
+      <w:r>
+        <w:t xml:space="preserve"> </w:t>
+      </w:r>
+      <w:r>
+        <w:t xml:space="preserve">review.</w:t>
+      </w:r>
+    </w:p>
+    <w:p>
+      <w:pPr>
+        <w:pStyle w:val="BodyText"/>
       </w:pPr>
       <w:r>
         <w:rPr>
@@ -16415,6 +16862,68 @@
       </w:r>
       <w:r>
         <w:t xml:space="preserve">. Owners can always tighten or widen an individual object.</w:t>
+      </w:r>
+      <w:r>
+        <w:t xml:space="preserve"> </w:t>
+      </w:r>
+      <w:r>
+        <w:rPr>
+          <w:i/>
+          <w:iCs/>
+        </w:rPr>
+        <w:t xml:space="preserve">Revision 2.4:</w:t>
+      </w:r>
+      <w:r>
+        <w:t xml:space="preserve"> </w:t>
+      </w:r>
+      <w:r>
+        <w:t xml:space="preserve">the two open levels behaved identically, because MAYA had no notion of belonging to a namespace. A namespace’s</w:t>
+      </w:r>
+      <w:r>
+        <w:t xml:space="preserve"> </w:t>
+      </w:r>
+      <w:r>
+        <w:rPr>
+          <w:b/>
+          <w:bCs/>
+        </w:rPr>
+        <w:t xml:space="preserve">people</w:t>
+      </w:r>
+      <w:r>
+        <w:t xml:space="preserve"> </w:t>
+      </w:r>
+      <w:r>
+        <w:t xml:space="preserve">are its owner, anyone holding a grant on it, and holders of the roles its preset staffs (§28.9);</w:t>
+      </w:r>
+      <w:r>
+        <w:t xml:space="preserve"> </w:t>
+      </w:r>
+      <w:r>
+        <w:rPr>
+          <w:rStyle w:val="VerbatimChar"/>
+        </w:rPr>
+        <w:t xml:space="preserve">namespace_read</w:t>
+      </w:r>
+      <w:r>
+        <w:t xml:space="preserve"> </w:t>
+      </w:r>
+      <w:r>
+        <w:t xml:space="preserve">reads to them,</w:t>
+      </w:r>
+      <w:r>
+        <w:t xml:space="preserve"> </w:t>
+      </w:r>
+      <w:r>
+        <w:rPr>
+          <w:rStyle w:val="VerbatimChar"/>
+        </w:rPr>
+        <w:t xml:space="preserve">public_read</w:t>
+      </w:r>
+      <w:r>
+        <w:t xml:space="preserve"> </w:t>
+      </w:r>
+      <w:r>
+        <w:t xml:space="preserve">to anyone signed in. An explicit grant is decided first either way.</w:t>
       </w:r>
     </w:p>
     <w:p>
@@ -29096,7 +29605,7 @@
         <w:rPr>
           <w:rStyle w:val="NormalTok"/>
         </w:rPr>
-        <w:t xml:space="preserve">)            </w:t>
+        <w:t xml:space="preserve">)  </w:t>
       </w:r>
       <w:r>
         <w:rPr>
@@ -29543,7 +30052,7 @@
         <w:rPr>
           <w:rStyle w:val="NormalTok"/>
         </w:rPr>
-        <w:t xml:space="preserve">)               </w:t>
+        <w:t xml:space="preserve">)  </w:t>
       </w:r>
       <w:r>
         <w:rPr>
@@ -29591,7 +30100,7 @@
         <w:rPr>
           <w:rStyle w:val="NormalTok"/>
         </w:rPr>
-        <w:t xml:space="preserve">)          </w:t>
+        <w:t xml:space="preserve">)  </w:t>
       </w:r>
       <w:r>
         <w:rPr>
@@ -29732,7 +30241,16 @@
         <w:rPr>
           <w:rStyle w:val="NormalTok"/>
         </w:rPr>
-        <w:t xml:space="preserve"> my.warrants.training.create(model</w:t>
+        <w:t xml:space="preserve"> my.warrants.training.create(</w:t>
+      </w:r>
+      <w:r>
+        <w:br/>
+      </w:r>
+      <w:r>
+        <w:rPr>
+          <w:rStyle w:val="NormalTok"/>
+        </w:rPr>
+        <w:t xml:space="preserve">    model</w:t>
       </w:r>
       <w:r>
         <w:rPr>
@@ -29759,7 +30277,7 @@
         <w:rPr>
           <w:rStyle w:val="NormalTok"/>
         </w:rPr>
-        <w:t xml:space="preserve">                                      featureset</w:t>
+        <w:t xml:space="preserve">    featureset</w:t>
       </w:r>
       <w:r>
         <w:rPr>
@@ -29786,7 +30304,7 @@
         <w:rPr>
           <w:rStyle w:val="NormalTok"/>
         </w:rPr>
-        <w:t xml:space="preserve">                                      split</w:t>
+        <w:t xml:space="preserve">    split</w:t>
       </w:r>
       <w:r>
         <w:rPr>
@@ -29879,7 +30397,7 @@
         <w:rPr>
           <w:rStyle w:val="NormalTok"/>
         </w:rPr>
-        <w:t xml:space="preserve">                                      seed</w:t>
+        <w:t xml:space="preserve">    seed</w:t>
       </w:r>
       <w:r>
         <w:rPr>
@@ -29897,7 +30415,16 @@
         <w:rPr>
           <w:rStyle w:val="NormalTok"/>
         </w:rPr>
-        <w:t xml:space="preserve">, holdout</w:t>
+        <w:t xml:space="preserve">,</w:t>
+      </w:r>
+      <w:r>
+        <w:br/>
+      </w:r>
+      <w:r>
+        <w:rPr>
+          <w:rStyle w:val="NormalTok"/>
+        </w:rPr>
+        <w:t xml:space="preserve">    holdout</w:t>
       </w:r>
       <w:r>
         <w:rPr>
@@ -29915,6 +30442,15 @@
         <w:rPr>
           <w:rStyle w:val="NormalTok"/>
         </w:rPr>
+        <w:t xml:space="preserve">,</w:t>
+      </w:r>
+      <w:r>
+        <w:br/>
+      </w:r>
+      <w:r>
+        <w:rPr>
+          <w:rStyle w:val="NormalTok"/>
+        </w:rPr>
         <w:t xml:space="preserve">)</w:t>
       </w:r>
       <w:r>
@@ -29960,7 +30496,7 @@
         <w:rPr>
           <w:rStyle w:val="NormalTok"/>
         </w:rPr>
-        <w:t xml:space="preserve"> ds:     </w:t>
+        <w:t xml:space="preserve"> ds:  </w:t>
       </w:r>
       <w:r>
         <w:rPr>
@@ -30074,7 +30610,7 @@
         <w:rPr>
           <w:rStyle w:val="NormalTok"/>
         </w:rPr>
-        <w:t xml:space="preserve"> warrant.score_holdout(params)        </w:t>
+        <w:t xml:space="preserve"> warrant.score_holdout(params)  </w:t>
       </w:r>
       <w:r>
         <w:rPr>
@@ -30209,7 +30745,7 @@
         <w:rPr>
           <w:rStyle w:val="NormalTok"/>
         </w:rPr>
-        <w:t xml:space="preserve">(ws.shadow_replay().summary())       </w:t>
+        <w:t xml:space="preserve">(ws.shadow_replay().summary())  </w:t>
       </w:r>
       <w:r>
         <w:rPr>

</xml_diff>

<commit_message>
Purge a namespace in a development estate; case studies reset one study and clean up after a failure
</commit_message>
<xml_diff>
--- a/docs/MAYA_Requirements_and_Design.docx
+++ b/docs/MAYA_Requirements_and_Design.docx
@@ -184,7 +184,13 @@
         <w:t xml:space="preserve"> </w:t>
       </w:r>
       <w:r>
-        <w:t xml:space="preserve">a test layer (§23); and the competitive analysis as a public page (§27).</w:t>
+        <w:t xml:space="preserve">a test layer (§23); the competitive analysis as a public page (§27); and purging a namespace in a</w:t>
+      </w:r>
+      <w:r>
+        <w:t xml:space="preserve"> </w:t>
+      </w:r>
+      <w:r>
+        <w:t xml:space="preserve">development estate, the one deletion MAYA allows (§20).</w:t>
       </w:r>
     </w:p>
     <w:p>
@@ -36070,6 +36076,149 @@
     <w:p>
       <w:pPr>
         <w:pStyle w:val="FirstParagraph"/>
+      </w:pPr>
+      <w:r>
+        <w:rPr>
+          <w:i/>
+          <w:iCs/>
+        </w:rPr>
+        <w:t xml:space="preserve">Revision 2.7:</w:t>
+      </w:r>
+      <w:r>
+        <w:t xml:space="preserve"> </w:t>
+      </w:r>
+      <w:r>
+        <w:rPr>
+          <w:b/>
+          <w:bCs/>
+        </w:rPr>
+        <w:t xml:space="preserve">purging a namespace</w:t>
+      </w:r>
+      <w:r>
+        <w:t xml:space="preserve">, the one deletion MAYA allows. In a development estate</w:t>
+      </w:r>
+      <w:r>
+        <w:t xml:space="preserve"> </w:t>
+      </w:r>
+      <w:r>
+        <w:t xml:space="preserve">(</w:t>
+      </w:r>
+      <w:r>
+        <w:rPr>
+          <w:rStyle w:val="VerbatimChar"/>
+        </w:rPr>
+        <w:t xml:space="preserve">app.environment: dev</w:t>
+      </w:r>
+      <w:r>
+        <w:t xml:space="preserve">) an administrator may remove a namespace and everything in it — every row that</w:t>
+      </w:r>
+      <w:r>
+        <w:t xml:space="preserve"> </w:t>
+      </w:r>
+      <w:r>
+        <w:t xml:space="preserve">belongs to it, found by foreign key, by object id and by reference, and its folders in the lake — in one</w:t>
+      </w:r>
+      <w:r>
+        <w:t xml:space="preserve"> </w:t>
+      </w:r>
+      <w:r>
+        <w:t xml:space="preserve">transaction, typing the name again to confirm (</w:t>
+      </w:r>
+      <w:r>
+        <w:rPr>
+          <w:rStyle w:val="VerbatimChar"/>
+        </w:rPr>
+        <w:t xml:space="preserve">POST /namespaces/{name}/purge</w:t>
+      </w:r>
+      <w:r>
+        <w:t xml:space="preserve">,</w:t>
+      </w:r>
+      <w:r>
+        <w:t xml:space="preserve"> </w:t>
+      </w:r>
+      <w:r>
+        <w:rPr>
+          <w:b/>
+          <w:bCs/>
+        </w:rPr>
+        <w:t xml:space="preserve">Admin → Namespaces</w:t>
+      </w:r>
+      <w:r>
+        <w:t xml:space="preserve">).</w:t>
+      </w:r>
+      <w:r>
+        <w:t xml:space="preserve"> </w:t>
+      </w:r>
+      <w:r>
+        <w:t xml:space="preserve">Anywhere else it is refused: a register people rely on does not delete what it governs. The audit log and the</w:t>
+      </w:r>
+      <w:r>
+        <w:t xml:space="preserve"> </w:t>
+      </w:r>
+      <w:r>
+        <w:t xml:space="preserve">event stream are history and stay; the purge records itself in the audit log with what it removed. A</w:t>
+      </w:r>
+      <w:r>
+        <w:t xml:space="preserve"> </w:t>
+      </w:r>
+      <w:r>
+        <w:t xml:space="preserve">namespace with child namespaces is refused until they are purged. The case studies use it:</w:t>
+      </w:r>
+      <w:r>
+        <w:t xml:space="preserve"> </w:t>
+      </w:r>
+      <w:r>
+        <w:rPr>
+          <w:rStyle w:val="VerbatimChar"/>
+        </w:rPr>
+        <w:t xml:space="preserve">--reset</w:t>
+      </w:r>
+      <w:r>
+        <w:t xml:space="preserve"> </w:t>
+      </w:r>
+      <w:r>
+        <w:t xml:space="preserve">purges</w:t>
+      </w:r>
+      <w:r>
+        <w:t xml:space="preserve"> </w:t>
+      </w:r>
+      <w:r>
+        <w:t xml:space="preserve">the study’s own namespace before running, a failed full pass purges its partial work unless</w:t>
+      </w:r>
+      <w:r>
+        <w:t xml:space="preserve"> </w:t>
+      </w:r>
+      <w:r>
+        <w:rPr>
+          <w:rStyle w:val="VerbatimChar"/>
+        </w:rPr>
+        <w:t xml:space="preserve">--keep-on-failure</w:t>
+      </w:r>
+      <w:r>
+        <w:t xml:space="preserve"> </w:t>
+      </w:r>
+      <w:r>
+        <w:t xml:space="preserve">is given, and</w:t>
+      </w:r>
+      <w:r>
+        <w:t xml:space="preserve"> </w:t>
+      </w:r>
+      <w:r>
+        <w:rPr>
+          <w:rStyle w:val="VerbatimChar"/>
+        </w:rPr>
+        <w:t xml:space="preserve">--reset-all</w:t>
+      </w:r>
+      <w:r>
+        <w:t xml:space="preserve"> </w:t>
+      </w:r>
+      <w:r>
+        <w:t xml:space="preserve">rebuilds the whole estate.</w:t>
+      </w:r>
+    </w:p>
+    <w:p>
+      <w:pPr>
+        <w:pStyle w:val="BodyText"/>
       </w:pPr>
       <w:r>
         <w:rPr>

</xml_diff>

<commit_message>
Documents from the record: model cards, validation reports and model documentation from replaceable templates; an AI gateway with model profiles and pluggable providers
</commit_message>
<xml_diff>
--- a/docs/MAYA_Requirements_and_Design.docx
+++ b/docs/MAYA_Requirements_and_Design.docx
@@ -36,7 +36,7 @@
         </w:p>
       </w:sdtContent>
     </w:sdt>
-    <w:bookmarkStart w:id="194" w:name="X1066a4d42af2456ea8404a42c0c48b24e053952"/>
+    <w:bookmarkStart w:id="195" w:name="X1066a4d42af2456ea8404a42c0c48b24e053952"/>
     <w:p>
       <w:pPr>
         <w:pStyle w:val="Heading1"/>
@@ -61,6 +61,91 @@
       </w:r>
       <w:r>
         <w:t xml:space="preserve">· Version 2.0 (ground-up rebuild) · 2026-09-17 · Ash (Ashutosh Sinha)</w:t>
+      </w:r>
+    </w:p>
+    <w:p>
+      <w:pPr>
+        <w:pStyle w:val="BlockText"/>
+      </w:pPr>
+      <w:r>
+        <w:rPr>
+          <w:b/>
+          <w:bCs/>
+        </w:rPr>
+        <w:t xml:space="preserve">Revision 2.8 — 2026-09-28.</w:t>
+      </w:r>
+      <w:r>
+        <w:t xml:space="preserve"> </w:t>
+      </w:r>
+      <w:r>
+        <w:t xml:space="preserve">One decision: MAYA generates documents from a model’s record,</w:t>
+      </w:r>
+      <w:r>
+        <w:t xml:space="preserve"> </w:t>
+      </w:r>
+      <w:r>
+        <w:t xml:space="preserve">and may draft their prose with a language model it does not depend on. §21.6 specifies the AI</w:t>
+      </w:r>
+      <w:r>
+        <w:t xml:space="preserve"> </w:t>
+      </w:r>
+      <w:r>
+        <w:t xml:space="preserve">gateway — providers behind one interface at a new extension point,</w:t>
+      </w:r>
+      <w:r>
+        <w:t xml:space="preserve"> </w:t>
+      </w:r>
+      <w:r>
+        <w:rPr>
+          <w:rStyle w:val="VerbatimChar"/>
+        </w:rPr>
+        <w:t xml:space="preserve">llm_provider</w:t>
+      </w:r>
+      <w:r>
+        <w:t xml:space="preserve"> </w:t>
+      </w:r>
+      <w:r>
+        <w:t xml:space="preserve">(§25), and</w:t>
+      </w:r>
+      <w:r>
+        <w:t xml:space="preserve"> </w:t>
+      </w:r>
+      <w:r>
+        <w:t xml:space="preserve">callers that name a logical</w:t>
+      </w:r>
+      <w:r>
+        <w:t xml:space="preserve"> </w:t>
+      </w:r>
+      <w:r>
+        <w:rPr>
+          <w:b/>
+          <w:bCs/>
+        </w:rPr>
+        <w:t xml:space="preserve">model profile</w:t>
+      </w:r>
+      <w:r>
+        <w:t xml:space="preserve"> </w:t>
+      </w:r>
+      <w:r>
+        <w:t xml:space="preserve">rather than a provider or a model — and the</w:t>
+      </w:r>
+      <w:r>
+        <w:t xml:space="preserve"> </w:t>
+      </w:r>
+      <w:r>
+        <w:t xml:space="preserve">documents: a model card, a validation report and model documentation, each from a template a</w:t>
+      </w:r>
+      <w:r>
+        <w:t xml:space="preserve"> </w:t>
+      </w:r>
+      <w:r>
+        <w:t xml:space="preserve">firm replaces by placing a file, drafted sections labelled until a second person approves, and</w:t>
+      </w:r>
+      <w:r>
+        <w:t xml:space="preserve"> </w:t>
+      </w:r>
+      <w:r>
+        <w:t xml:space="preserve">the validator’s conclusion never drafted.</w:t>
       </w:r>
     </w:p>
     <w:p>
@@ -36435,7 +36520,7 @@
       </w:r>
     </w:p>
     <w:bookmarkEnd w:id="126"/>
-    <w:bookmarkStart w:id="132" w:name="security-and-model-risk-governance"/>
+    <w:bookmarkStart w:id="133" w:name="security-and-model-risk-governance"/>
     <w:p>
       <w:pPr>
         <w:pStyle w:val="Heading2"/>
@@ -37659,8 +37744,639 @@
       </w:r>
     </w:p>
     <w:bookmarkEnd w:id="131"/>
+    <w:bookmarkStart w:id="132" w:name="Xa8daebd9b1a293b9ef8afad4048a16b89d4f9fa"/>
+    <w:p>
+      <w:pPr>
+        <w:pStyle w:val="Heading3"/>
+      </w:pPr>
+      <w:r>
+        <w:t xml:space="preserve">21.6 Documents, and the language models that draft them</w:t>
+      </w:r>
+    </w:p>
+    <w:p>
+      <w:pPr>
+        <w:pStyle w:val="FirstParagraph"/>
+      </w:pPr>
+      <w:r>
+        <w:rPr>
+          <w:i/>
+          <w:iCs/>
+        </w:rPr>
+        <w:t xml:space="preserve">Revision 2.8.</w:t>
+      </w:r>
+    </w:p>
+    <w:p>
+      <w:pPr>
+        <w:pStyle w:val="BodyText"/>
+      </w:pPr>
+      <w:r>
+        <w:rPr>
+          <w:b/>
+          <w:bCs/>
+        </w:rPr>
+        <w:t xml:space="preserve">The AI gateway.</w:t>
+      </w:r>
+      <w:r>
+        <w:t xml:space="preserve"> </w:t>
+      </w:r>
+      <w:r>
+        <w:t xml:space="preserve">Every request MAYA makes of a language model goes through one service. A caller</w:t>
+      </w:r>
+      <w:r>
+        <w:t xml:space="preserve"> </w:t>
+      </w:r>
+      <w:r>
+        <w:t xml:space="preserve">names a</w:t>
+      </w:r>
+      <w:r>
+        <w:t xml:space="preserve"> </w:t>
+      </w:r>
+      <w:r>
+        <w:rPr>
+          <w:b/>
+          <w:bCs/>
+        </w:rPr>
+        <w:t xml:space="preserve">model profile</w:t>
+      </w:r>
+      <w:r>
+        <w:t xml:space="preserve"> </w:t>
+      </w:r>
+      <w:r>
+        <w:t xml:space="preserve">— a logical model such as</w:t>
+      </w:r>
+      <w:r>
+        <w:t xml:space="preserve"> </w:t>
+      </w:r>
+      <w:r>
+        <w:rPr>
+          <w:rStyle w:val="VerbatimChar"/>
+        </w:rPr>
+        <w:t xml:space="preserve">drafting</w:t>
+      </w:r>
+      <w:r>
+        <w:t xml:space="preserve"> </w:t>
+      </w:r>
+      <w:r>
+        <w:t xml:space="preserve">or</w:t>
+      </w:r>
+      <w:r>
+        <w:t xml:space="preserve"> </w:t>
+      </w:r>
+      <w:r>
+        <w:rPr>
+          <w:rStyle w:val="VerbatimChar"/>
+        </w:rPr>
+        <w:t xml:space="preserve">local</w:t>
+      </w:r>
+      <w:r>
+        <w:t xml:space="preserve"> </w:t>
+      </w:r>
+      <w:r>
+        <w:t xml:space="preserve">— never a provider or a model.</w:t>
+      </w:r>
+      <w:r>
+        <w:t xml:space="preserve"> </w:t>
+      </w:r>
+      <w:r>
+        <w:t xml:space="preserve">Profiles live in</w:t>
+      </w:r>
+      <w:r>
+        <w:t xml:space="preserve"> </w:t>
+      </w:r>
+      <w:r>
+        <w:rPr>
+          <w:rStyle w:val="VerbatimChar"/>
+        </w:rPr>
+        <w:t xml:space="preserve">config/llm_profiles.yaml</w:t>
+      </w:r>
+      <w:r>
+        <w:t xml:space="preserve"> </w:t>
+      </w:r>
+      <w:r>
+        <w:t xml:space="preserve">(</w:t>
+      </w:r>
+      <w:r>
+        <w:rPr>
+          <w:rStyle w:val="VerbatimChar"/>
+        </w:rPr>
+        <w:t xml:space="preserve">llm.profiles_file</w:t>
+      </w:r>
+      <w:r>
+        <w:t xml:space="preserve">): each names a provider, a model, the</w:t>
+      </w:r>
+      <w:r>
+        <w:t xml:space="preserve"> </w:t>
+      </w:r>
+      <w:r>
+        <w:t xml:space="preserve">parameters to ask with (</w:t>
+      </w:r>
+      <w:r>
+        <w:rPr>
+          <w:rStyle w:val="VerbatimChar"/>
+        </w:rPr>
+        <w:t xml:space="preserve">max_tokens</w:t>
+      </w:r>
+      <w:r>
+        <w:t xml:space="preserve">,</w:t>
+      </w:r>
+      <w:r>
+        <w:t xml:space="preserve"> </w:t>
+      </w:r>
+      <w:r>
+        <w:rPr>
+          <w:rStyle w:val="VerbatimChar"/>
+        </w:rPr>
+        <w:t xml:space="preserve">temperature</w:t>
+      </w:r>
+      <w:r>
+        <w:t xml:space="preserve">) and any option of that provider this profile needs</w:t>
+      </w:r>
+      <w:r>
+        <w:t xml:space="preserve"> </w:t>
+      </w:r>
+      <w:r>
+        <w:t xml:space="preserve">differently (a base URL, a region, the environment variable holding a key). Without the file there is one</w:t>
+      </w:r>
+      <w:r>
+        <w:t xml:space="preserve"> </w:t>
+      </w:r>
+      <w:r>
+        <w:t xml:space="preserve">profile,</w:t>
+      </w:r>
+      <w:r>
+        <w:t xml:space="preserve"> </w:t>
+      </w:r>
+      <w:r>
+        <w:rPr>
+          <w:rStyle w:val="VerbatimChar"/>
+        </w:rPr>
+        <w:t xml:space="preserve">default</w:t>
+      </w:r>
+      <w:r>
+        <w:t xml:space="preserve">, from the</w:t>
+      </w:r>
+      <w:r>
+        <w:t xml:space="preserve"> </w:t>
+      </w:r>
+      <w:r>
+        <w:rPr>
+          <w:rStyle w:val="VerbatimChar"/>
+        </w:rPr>
+        <w:t xml:space="preserve">llm.*</w:t>
+      </w:r>
+      <w:r>
+        <w:t xml:space="preserve"> </w:t>
+      </w:r>
+      <w:r>
+        <w:t xml:space="preserve">settings. Providers implement one interface —</w:t>
+      </w:r>
+      <w:r>
+        <w:t xml:space="preserve"> </w:t>
+      </w:r>
+      <w:r>
+        <w:rPr>
+          <w:rStyle w:val="VerbatimChar"/>
+        </w:rPr>
+        <w:t xml:space="preserve">complete(system, messages, max_tokens, temperature)</w:t>
+      </w:r>
+      <w:r>
+        <w:t xml:space="preserve"> </w:t>
+      </w:r>
+      <w:r>
+        <w:t xml:space="preserve">returning text and token counts — and are registered</w:t>
+      </w:r>
+      <w:r>
+        <w:t xml:space="preserve"> </w:t>
+      </w:r>
+      <w:r>
+        <w:t xml:space="preserve">at the</w:t>
+      </w:r>
+      <w:r>
+        <w:t xml:space="preserve"> </w:t>
+      </w:r>
+      <w:r>
+        <w:rPr>
+          <w:rStyle w:val="VerbatimChar"/>
+        </w:rPr>
+        <w:t xml:space="preserve">llm_provider</w:t>
+      </w:r>
+      <w:r>
+        <w:t xml:space="preserve"> </w:t>
+      </w:r>
+      <w:r>
+        <w:t xml:space="preserve">extension point:</w:t>
+      </w:r>
+      <w:r>
+        <w:t xml:space="preserve"> </w:t>
+      </w:r>
+      <w:r>
+        <w:rPr>
+          <w:rStyle w:val="VerbatimChar"/>
+        </w:rPr>
+        <w:t xml:space="preserve">anthropic</w:t>
+      </w:r>
+      <w:r>
+        <w:t xml:space="preserve"> </w:t>
+      </w:r>
+      <w:r>
+        <w:t xml:space="preserve">(the official SDK, streamed, adaptive thinking),</w:t>
+      </w:r>
+      <w:r>
+        <w:t xml:space="preserve"> </w:t>
+      </w:r>
+      <w:r>
+        <w:rPr>
+          <w:rStyle w:val="VerbatimChar"/>
+        </w:rPr>
+        <w:t xml:space="preserve">openai</w:t>
+      </w:r>
+      <w:r>
+        <w:t xml:space="preserve"> </w:t>
+      </w:r>
+      <w:r>
+        <w:t xml:space="preserve">and any server speaking its Chat Completions API,</w:t>
+      </w:r>
+      <w:r>
+        <w:t xml:space="preserve"> </w:t>
+      </w:r>
+      <w:r>
+        <w:rPr>
+          <w:rStyle w:val="VerbatimChar"/>
+        </w:rPr>
+        <w:t xml:space="preserve">azure_openai</w:t>
+      </w:r>
+      <w:r>
+        <w:t xml:space="preserve">,</w:t>
+      </w:r>
+      <w:r>
+        <w:t xml:space="preserve"> </w:t>
+      </w:r>
+      <w:r>
+        <w:rPr>
+          <w:rStyle w:val="VerbatimChar"/>
+        </w:rPr>
+        <w:t xml:space="preserve">ollama</w:t>
+      </w:r>
+      <w:r>
+        <w:t xml:space="preserve">,</w:t>
+      </w:r>
+      <w:r>
+        <w:t xml:space="preserve"> </w:t>
+      </w:r>
+      <w:r>
+        <w:rPr>
+          <w:rStyle w:val="VerbatimChar"/>
+        </w:rPr>
+        <w:t xml:space="preserve">bedrock</w:t>
+      </w:r>
+      <w:r>
+        <w:t xml:space="preserve"> </w:t>
+      </w:r>
+      <w:r>
+        <w:t xml:space="preserve">(</w:t>
+      </w:r>
+      <w:r>
+        <w:rPr>
+          <w:rStyle w:val="VerbatimChar"/>
+        </w:rPr>
+        <w:t xml:space="preserve">boto3</w:t>
+      </w:r>
+      <w:r>
+        <w:t xml:space="preserve">),</w:t>
+      </w:r>
+      <w:r>
+        <w:t xml:space="preserve"> </w:t>
+      </w:r>
+      <w:r>
+        <w:rPr>
+          <w:rStyle w:val="VerbatimChar"/>
+        </w:rPr>
+        <w:t xml:space="preserve">stub</w:t>
+      </w:r>
+      <w:r>
+        <w:t xml:space="preserve"> </w:t>
+      </w:r>
+      <w:r>
+        <w:t xml:space="preserve">(deterministic, offline) and</w:t>
+      </w:r>
+      <w:r>
+        <w:t xml:space="preserve"> </w:t>
+      </w:r>
+      <w:r>
+        <w:rPr>
+          <w:rStyle w:val="VerbatimChar"/>
+        </w:rPr>
+        <w:t xml:space="preserve">none</w:t>
+      </w:r>
+      <w:r>
+        <w:t xml:space="preserve"> </w:t>
+      </w:r>
+      <w:r>
+        <w:t xml:space="preserve">(the default: nothing is drafted). A third party adds a provider as an</w:t>
+      </w:r>
+      <w:r>
+        <w:t xml:space="preserve"> </w:t>
+      </w:r>
+      <w:r>
+        <w:t xml:space="preserve">entry-point plugin, loaded only when</w:t>
+      </w:r>
+      <w:r>
+        <w:t xml:space="preserve"> </w:t>
+      </w:r>
+      <w:r>
+        <w:rPr>
+          <w:rStyle w:val="VerbatimChar"/>
+        </w:rPr>
+        <w:t xml:space="preserve">plugins.allow</w:t>
+      </w:r>
+      <w:r>
+        <w:t xml:space="preserve"> </w:t>
+      </w:r>
+      <w:r>
+        <w:t xml:space="preserve">names it (§25). API keys are never configuration: a</w:t>
+      </w:r>
+      <w:r>
+        <w:t xml:space="preserve"> </w:t>
+      </w:r>
+      <w:r>
+        <w:t xml:space="preserve">setting names the environment variable that holds one. Every call is audited with its purpose, profile,</w:t>
+      </w:r>
+      <w:r>
+        <w:t xml:space="preserve"> </w:t>
+      </w:r>
+      <w:r>
+        <w:t xml:space="preserve">provider, model, token counts and the hash of the prompt; the prompt is not logged, because it carries a</w:t>
+      </w:r>
+      <w:r>
+        <w:t xml:space="preserve"> </w:t>
+      </w:r>
+      <w:r>
+        <w:t xml:space="preserve">model’s facts and the audit log’s readers may not be entitled to them.</w:t>
+      </w:r>
+    </w:p>
+    <w:p>
+      <w:pPr>
+        <w:pStyle w:val="BodyText"/>
+      </w:pPr>
+      <w:r>
+        <w:rPr>
+          <w:b/>
+          <w:bCs/>
+        </w:rPr>
+        <w:t xml:space="preserve">Documents.</w:t>
+      </w:r>
+      <w:r>
+        <w:t xml:space="preserve"> </w:t>
+      </w:r>
+      <w:r>
+        <w:t xml:space="preserve">A document is generated from a snapshot of one model version’s record — its mathematics and</w:t>
+      </w:r>
+      <w:r>
+        <w:t xml:space="preserve"> </w:t>
+      </w:r>
+      <w:r>
+        <w:t xml:space="preserve">contract, code checks, warrants, leakage certificate, blind scores, fairness and importance evidence,</w:t>
+      </w:r>
+      <w:r>
+        <w:t xml:space="preserve"> </w:t>
+      </w:r>
+      <w:r>
+        <w:t xml:space="preserve">challengers, findings, reviews, covenants and monitoring — gathered through the services under the</w:t>
+      </w:r>
+      <w:r>
+        <w:t xml:space="preserve"> </w:t>
+      </w:r>
+      <w:r>
+        <w:t xml:space="preserve">requester’s own read permissions, and hashed. Three kinds ship: a</w:t>
+      </w:r>
+      <w:r>
+        <w:t xml:space="preserve"> </w:t>
+      </w:r>
+      <w:r>
+        <w:rPr>
+          <w:b/>
+          <w:bCs/>
+        </w:rPr>
+        <w:t xml:space="preserve">model card</w:t>
+      </w:r>
+      <w:r>
+        <w:t xml:space="preserve">, a</w:t>
+      </w:r>
+      <w:r>
+        <w:t xml:space="preserve"> </w:t>
+      </w:r>
+      <w:r>
+        <w:rPr>
+          <w:b/>
+          <w:bCs/>
+        </w:rPr>
+        <w:t xml:space="preserve">validation report</w:t>
+      </w:r>
+      <w:r>
+        <w:t xml:space="preserve"> </w:t>
+      </w:r>
+      <w:r>
+        <w:t xml:space="preserve">and</w:t>
+      </w:r>
+      <w:r>
+        <w:t xml:space="preserve"> </w:t>
+      </w:r>
+      <w:r>
+        <w:rPr>
+          <w:b/>
+          <w:bCs/>
+        </w:rPr>
+        <w:t xml:space="preserve">model documentation</w:t>
+      </w:r>
+      <w:r>
+        <w:t xml:space="preserve">, each a Jinja2 template producing Markdown. A firm changes one by placing a file</w:t>
+      </w:r>
+      <w:r>
+        <w:t xml:space="preserve"> </w:t>
+      </w:r>
+      <w:r>
+        <w:t xml:space="preserve">of the same name in</w:t>
+      </w:r>
+      <w:r>
+        <w:t xml:space="preserve"> </w:t>
+      </w:r>
+      <w:r>
+        <w:rPr>
+          <w:rStyle w:val="VerbatimChar"/>
+        </w:rPr>
+        <w:t xml:space="preserve">documents.template_dir</w:t>
+      </w:r>
+      <w:r>
+        <w:t xml:space="preserve">; any other template there is offered for the kind its first</w:t>
+      </w:r>
+      <w:r>
+        <w:t xml:space="preserve"> </w:t>
+      </w:r>
+      <w:r>
+        <w:t xml:space="preserve">line declares. A template calls</w:t>
+      </w:r>
+      <w:r>
+        <w:t xml:space="preserve"> </w:t>
+      </w:r>
+      <w:r>
+        <w:rPr>
+          <w:rStyle w:val="VerbatimChar"/>
+        </w:rPr>
+        <w:t xml:space="preserve">ai(key, instruction, profile=…)</w:t>
+      </w:r>
+      <w:r>
+        <w:t xml:space="preserve"> </w:t>
+      </w:r>
+      <w:r>
+        <w:t xml:space="preserve">for a section to be drafted; the model is</w:t>
+      </w:r>
+      <w:r>
+        <w:t xml:space="preserve"> </w:t>
+      </w:r>
+      <w:r>
+        <w:t xml:space="preserve">given the facts and told to use nothing else and to write</w:t>
+      </w:r>
+      <w:r>
+        <w:t xml:space="preserve"> </w:t>
+      </w:r>
+      <w:r>
+        <w:t xml:space="preserve">“not recorded”</w:t>
+      </w:r>
+      <w:r>
+        <w:t xml:space="preserve"> </w:t>
+      </w:r>
+      <w:r>
+        <w:t xml:space="preserve">rather than invent. The document</w:t>
+      </w:r>
+      <w:r>
+        <w:t xml:space="preserve"> </w:t>
+      </w:r>
+      <w:r>
+        <w:t xml:space="preserve">stores its template and the template’s hash, the facts’ hash, the provider and model, and its text; it</w:t>
+      </w:r>
+      <w:r>
+        <w:t xml:space="preserve"> </w:t>
+      </w:r>
+      <w:r>
+        <w:t xml:space="preserve">renders as Markdown, HTML (with all raw HTML escaped) or PDF (through §17’s typesetting, falling back to the</w:t>
+      </w:r>
+      <w:r>
+        <w:t xml:space="preserve"> </w:t>
+      </w:r>
+      <w:r>
+        <w:t xml:space="preserve">draft renderer, and saying so, when a build fails). Each drafted section is shown labelled as drafted by</w:t>
+      </w:r>
+      <w:r>
+        <w:t xml:space="preserve"> </w:t>
+      </w:r>
+      <w:r>
+        <w:t xml:space="preserve">that provider and model and not reviewed, until someone</w:t>
+      </w:r>
+      <w:r>
+        <w:t xml:space="preserve"> </w:t>
+      </w:r>
+      <w:r>
+        <w:rPr>
+          <w:b/>
+          <w:bCs/>
+        </w:rPr>
+        <w:t xml:space="preserve">other than the person who generated it</w:t>
+      </w:r>
+      <w:r>
+        <w:t xml:space="preserve"> </w:t>
+      </w:r>
+      <w:r>
+        <w:t xml:space="preserve">approves</w:t>
+      </w:r>
+      <w:r>
+        <w:t xml:space="preserve"> </w:t>
+      </w:r>
+      <w:r>
+        <w:t xml:space="preserve">the document; the label then names the reviewer. The built-in validation report never drafts its</w:t>
+      </w:r>
+      <w:r>
+        <w:t xml:space="preserve"> </w:t>
+      </w:r>
+      <w:r>
+        <w:t xml:space="preserve">conclusion: fitness for use is irreducibly declared (§28), and the report leaves the validator a place for it.</w:t>
+      </w:r>
+      <w:r>
+        <w:t xml:space="preserve"> </w:t>
+      </w:r>
+      <w:r>
+        <w:t xml:space="preserve">Without a configured model, or with drafting off, each drafted section says it was not drafted and the rest</w:t>
+      </w:r>
+      <w:r>
+        <w:t xml:space="preserve"> </w:t>
+      </w:r>
+      <w:r>
+        <w:t xml:space="preserve">of the document is complete. Documents are generated as jobs, listed on a model’s</w:t>
+      </w:r>
+      <w:r>
+        <w:t xml:space="preserve"> </w:t>
+      </w:r>
+      <w:r>
+        <w:rPr>
+          <w:b/>
+          <w:bCs/>
+        </w:rPr>
+        <w:t xml:space="preserve">Documents</w:t>
+      </w:r>
+      <w:r>
+        <w:t xml:space="preserve"> </w:t>
+      </w:r>
+      <w:r>
+        <w:t xml:space="preserve">tab, and</w:t>
+      </w:r>
+      <w:r>
+        <w:t xml:space="preserve"> </w:t>
+      </w:r>
+      <w:r>
+        <w:t xml:space="preserve">reachable through</w:t>
+      </w:r>
+      <w:r>
+        <w:t xml:space="preserve"> </w:t>
+      </w:r>
+      <w:r>
+        <w:rPr>
+          <w:rStyle w:val="VerbatimChar"/>
+        </w:rPr>
+        <w:t xml:space="preserve">POST /models/{namespace}/{name}/documents</w:t>
+      </w:r>
+      <w:r>
+        <w:t xml:space="preserve">,</w:t>
+      </w:r>
+      <w:r>
+        <w:t xml:space="preserve"> </w:t>
+      </w:r>
+      <w:r>
+        <w:rPr>
+          <w:rStyle w:val="VerbatimChar"/>
+        </w:rPr>
+        <w:t xml:space="preserve">GET /documents/{id}/render</w:t>
+      </w:r>
+      <w:r>
+        <w:t xml:space="preserve"> </w:t>
+      </w:r>
+      <w:r>
+        <w:t xml:space="preserve">and</w:t>
+      </w:r>
+      <w:r>
+        <w:t xml:space="preserve"> </w:t>
+      </w:r>
+      <w:r>
+        <w:rPr>
+          <w:rStyle w:val="VerbatimChar"/>
+        </w:rPr>
+        <w:t xml:space="preserve">POST /documents/{id}/approve</w:t>
+      </w:r>
+      <w:r>
+        <w:t xml:space="preserve">.</w:t>
+      </w:r>
+    </w:p>
     <w:bookmarkEnd w:id="132"/>
-    <w:bookmarkStart w:id="137" w:name="engineering-standards"/>
+    <w:bookmarkEnd w:id="133"/>
+    <w:bookmarkStart w:id="138" w:name="engineering-standards"/>
     <w:p>
       <w:pPr>
         <w:pStyle w:val="Heading2"/>
@@ -37669,7 +38385,7 @@
         <w:t xml:space="preserve">22. Engineering standards</w:t>
       </w:r>
     </w:p>
-    <w:bookmarkStart w:id="133" w:name="size-and-modularity"/>
+    <w:bookmarkStart w:id="134" w:name="size-and-modularity"/>
     <w:p>
       <w:pPr>
         <w:pStyle w:val="Heading3"/>
@@ -37806,8 +38522,8 @@
         <w:t xml:space="preserve">module; implementations never import each other.</w:t>
       </w:r>
     </w:p>
-    <w:bookmarkEnd w:id="133"/>
-    <w:bookmarkStart w:id="134" w:name="typing-and-errors"/>
+    <w:bookmarkEnd w:id="134"/>
+    <w:bookmarkStart w:id="135" w:name="typing-and-errors"/>
     <w:p>
       <w:pPr>
         <w:pStyle w:val="Heading3"/>
@@ -37866,8 +38582,8 @@
         <w:t xml:space="preserve">; no swallowed exceptions except in deliberately defensive audit and recording paths, as in DishtaYantra. No silent config defaults — an unset required setting fails at startup with the setting’s name and an example value.</w:t>
       </w:r>
     </w:p>
-    <w:bookmarkEnd w:id="134"/>
-    <w:bookmarkStart w:id="135" w:name="package-layout-1"/>
+    <w:bookmarkEnd w:id="135"/>
+    <w:bookmarkStart w:id="136" w:name="package-layout-1"/>
     <w:p>
       <w:pPr>
         <w:pStyle w:val="Heading3"/>
@@ -38372,8 +39088,8 @@
         <w:t xml:space="preserve">size gate notices.</w:t>
       </w:r>
     </w:p>
-    <w:bookmarkEnd w:id="135"/>
-    <w:bookmarkStart w:id="136" w:name="conventions"/>
+    <w:bookmarkEnd w:id="136"/>
+    <w:bookmarkStart w:id="137" w:name="conventions"/>
     <w:p>
       <w:pPr>
         <w:pStyle w:val="Heading3"/>
@@ -38490,9 +39206,9 @@
         <w:t xml:space="preserve">separator baked into anything stored or compared.</w:t>
       </w:r>
     </w:p>
-    <w:bookmarkEnd w:id="136"/>
     <w:bookmarkEnd w:id="137"/>
-    <w:bookmarkStart w:id="138" w:name="testing-and-release-engineering"/>
+    <w:bookmarkEnd w:id="138"/>
+    <w:bookmarkStart w:id="139" w:name="testing-and-release-engineering"/>
     <w:p>
       <w:pPr>
         <w:pStyle w:val="Heading2"/>
@@ -39191,8 +39907,8 @@
         <w:t xml:space="preserve">an estate export and reload rehearsed on a production-shaped copy, §14.3), canary deployment, and a rollback tested in staging before every production release.</w:t>
       </w:r>
     </w:p>
-    <w:bookmarkEnd w:id="138"/>
-    <w:bookmarkStart w:id="144" w:name="deployment-configuration-and-capacity"/>
+    <w:bookmarkEnd w:id="139"/>
+    <w:bookmarkStart w:id="145" w:name="deployment-configuration-and-capacity"/>
     <w:p>
       <w:pPr>
         <w:pStyle w:val="Heading2"/>
@@ -39201,7 +39917,7 @@
         <w:t xml:space="preserve">24. Deployment, configuration and capacity</w:t>
       </w:r>
     </w:p>
-    <w:bookmarkStart w:id="139" w:name="topologies"/>
+    <w:bookmarkStart w:id="140" w:name="topologies"/>
     <w:p>
       <w:pPr>
         <w:pStyle w:val="Heading3"/>
@@ -39409,8 +40125,8 @@
         <w:t xml:space="preserve">The same artifact runs all four; only configuration differs. Containers are built reproducibly with pinned dependencies and run as a non-root user.</w:t>
       </w:r>
     </w:p>
-    <w:bookmarkEnd w:id="139"/>
-    <w:bookmarkStart w:id="140" w:name="configuration"/>
+    <w:bookmarkEnd w:id="140"/>
+    <w:bookmarkStart w:id="141" w:name="configuration"/>
     <w:p>
       <w:pPr>
         <w:pStyle w:val="Heading3"/>
@@ -39470,8 +40186,8 @@
         <w:t xml:space="preserve">: where a value materially changes behaviour — authentication mode, database URL, storage root, sandbox enablement — there is no default at all in non-dev environments. Secrets come from the environment or a vault reference, never from a file in the repo, and are redacted everywhere they could be displayed or logged.</w:t>
       </w:r>
     </w:p>
-    <w:bookmarkEnd w:id="140"/>
-    <w:bookmarkStart w:id="141" w:name="capacity-and-performance-targets"/>
+    <w:bookmarkEnd w:id="141"/>
+    <w:bookmarkStart w:id="142" w:name="capacity-and-performance-targets"/>
     <w:p>
       <w:pPr>
         <w:pStyle w:val="Heading3"/>
@@ -39751,8 +40467,8 @@
         <w:t xml:space="preserve">Scaling levers, in the order to pull them: add job workers (resolution is embarrassingly parallel across pins), add API pods, add read replicas for catalog queries, then partition namespaces across Delta roots. Vertical scaling of worker memory matters more than core count for wide tensor feature sets.</w:t>
       </w:r>
     </w:p>
-    <w:bookmarkEnd w:id="141"/>
-    <w:bookmarkStart w:id="142" w:name="client-connectivity"/>
+    <w:bookmarkEnd w:id="142"/>
+    <w:bookmarkStart w:id="143" w:name="client-connectivity"/>
     <w:p>
       <w:pPr>
         <w:pStyle w:val="Heading3"/>
@@ -39985,8 +40701,8 @@
         </w:tc>
       </w:tr>
     </w:tbl>
-    <w:bookmarkEnd w:id="142"/>
-    <w:bookmarkStart w:id="143" w:name="platform-support"/>
+    <w:bookmarkEnd w:id="143"/>
+    <w:bookmarkStart w:id="144" w:name="platform-support"/>
     <w:p>
       <w:pPr>
         <w:pStyle w:val="Heading3"/>
@@ -40795,9 +41511,9 @@
         <w:t xml:space="preserve">second set of startup invariants to get wrong.</w:t>
       </w:r>
     </w:p>
-    <w:bookmarkEnd w:id="143"/>
     <w:bookmarkEnd w:id="144"/>
-    <w:bookmarkStart w:id="145" w:name="extensibility-and-integrations"/>
+    <w:bookmarkEnd w:id="145"/>
+    <w:bookmarkStart w:id="146" w:name="extensibility-and-integrations"/>
     <w:p>
       <w:pPr>
         <w:pStyle w:val="Heading2"/>
@@ -41300,6 +42016,54 @@
           </w:p>
         </w:tc>
       </w:tr>
+      <w:tr>
+        <w:tc>
+          <w:tcPr/>
+          <w:p>
+            <w:pPr>
+              <w:pStyle w:val="Compact"/>
+            </w:pPr>
+            <w:r>
+              <w:t xml:space="preserve">Language-model provider</w:t>
+            </w:r>
+          </w:p>
+        </w:tc>
+        <w:tc>
+          <w:tcPr/>
+          <w:p>
+            <w:pPr>
+              <w:pStyle w:val="Compact"/>
+            </w:pPr>
+            <w:r>
+              <w:rPr>
+                <w:rStyle w:val="VerbatimChar"/>
+              </w:rPr>
+              <w:t xml:space="preserve">LlmProvider.complete(system, messages, max_tokens, temperature)</w:t>
+            </w:r>
+          </w:p>
+        </w:tc>
+        <w:tc>
+          <w:tcPr/>
+          <w:p>
+            <w:pPr>
+              <w:pStyle w:val="Compact"/>
+            </w:pPr>
+            <w:r>
+              <w:rPr>
+                <w:i/>
+                <w:iCs/>
+              </w:rPr>
+              <w:t xml:space="preserve">Revision 2.8:</w:t>
+            </w:r>
+            <w:r>
+              <w:t xml:space="preserve"> </w:t>
+            </w:r>
+            <w:r>
+              <w:t xml:space="preserve">anthropic, openai (and compatible servers), azure_openai, ollama, bedrock, stub, none; chosen through model profiles (§21.6)</w:t>
+            </w:r>
+          </w:p>
+        </w:tc>
+      </w:tr>
     </w:tbl>
     <w:p>
       <w:pPr>
@@ -41355,8 +42119,8 @@
         <w:t xml:space="preserve">, each thin because the event stream and API already exist: Git sync (export definitions as YAML to a repo and diff them there, so definitions live under source control too); Airflow/Prefect operators that resolve and pin on a schedule; Jupyter/JupyterLab extension for browsing the catalog and pulling a pin into a notebook in one cell; BI connectors reading pinned data directly from Delta; and an OpenLineage emitter so MAYA’s lineage joins a firm-wide graph rather than staying an island.</w:t>
       </w:r>
     </w:p>
-    <w:bookmarkEnd w:id="145"/>
-    <w:bookmarkStart w:id="149" w:name="roadmap-risks-and-open-decisions"/>
+    <w:bookmarkEnd w:id="146"/>
+    <w:bookmarkStart w:id="150" w:name="roadmap-risks-and-open-decisions"/>
     <w:p>
       <w:pPr>
         <w:pStyle w:val="Heading2"/>
@@ -41365,7 +42129,7 @@
         <w:t xml:space="preserve">26. Roadmap, risks and open decisions</w:t>
       </w:r>
     </w:p>
-    <w:bookmarkStart w:id="146" w:name="phases"/>
+    <w:bookmarkStart w:id="147" w:name="phases"/>
     <w:p>
       <w:pPr>
         <w:pStyle w:val="Heading3"/>
@@ -41733,8 +42497,8 @@
         <w:t xml:space="preserve">is unanswerable and a vendor restatement corrupts backtests silently, with nothing in the system to detect it. Content-addressed pin storage (§7.1, §29.3) fixes the physical layout: without it, cascade pins duplicate terabytes of unchanged history, and sealed pins cannot be rewritten to fix it afterwards. Everything else in §28 and §29 is additive and can arrive in a later phase; these two are one-way doors.</w:t>
       </w:r>
     </w:p>
-    <w:bookmarkEnd w:id="146"/>
-    <w:bookmarkStart w:id="147" w:name="top-risks"/>
+    <w:bookmarkEnd w:id="147"/>
+    <w:bookmarkStart w:id="148" w:name="top-risks"/>
     <w:p>
       <w:pPr>
         <w:pStyle w:val="Heading3"/>
@@ -42048,8 +42812,8 @@
         </w:tc>
       </w:tr>
     </w:tbl>
-    <w:bookmarkEnd w:id="147"/>
-    <w:bookmarkStart w:id="148" w:name="decisions-taken"/>
+    <w:bookmarkEnd w:id="148"/>
+    <w:bookmarkStart w:id="149" w:name="decisions-taken"/>
     <w:p>
       <w:pPr>
         <w:pStyle w:val="Heading3"/>
@@ -43084,9 +43848,9 @@
         <w:t xml:space="preserve">one, and it decides whether the finished platform lands into use or into silence.</w:t>
       </w:r>
     </w:p>
-    <w:bookmarkEnd w:id="148"/>
     <w:bookmarkEnd w:id="149"/>
-    <w:bookmarkStart w:id="165" w:name="competitive-analysis"/>
+    <w:bookmarkEnd w:id="150"/>
+    <w:bookmarkStart w:id="166" w:name="competitive-analysis"/>
     <w:p>
       <w:pPr>
         <w:pStyle w:val="Heading2"/>
@@ -43142,7 +43906,7 @@
         <w:t xml:space="preserve">each capability linked to how MAYA does it.</w:t>
       </w:r>
     </w:p>
-    <w:bookmarkStart w:id="154" w:name="the-landscape"/>
+    <w:bookmarkStart w:id="155" w:name="the-landscape"/>
     <w:p>
       <w:pPr>
         <w:pStyle w:val="Heading3"/>
@@ -43231,7 +43995,7 @@
             <w:pPr>
               <w:pStyle w:val="Compact"/>
             </w:pPr>
-            <w:hyperlink r:id="rId150">
+            <w:hyperlink r:id="rId151">
               <w:r>
                 <w:rPr>
                   <w:rStyle w:val="Hyperlink"/>
@@ -43245,7 +44009,7 @@
             <w:r>
               <w:t xml:space="preserve"> </w:t>
             </w:r>
-            <w:hyperlink r:id="rId151">
+            <w:hyperlink r:id="rId152">
               <w:r>
                 <w:rPr>
                   <w:rStyle w:val="Hyperlink"/>
@@ -43262,7 +44026,7 @@
             <w:r>
               <w:t xml:space="preserve"> </w:t>
             </w:r>
-            <w:hyperlink r:id="rId152">
+            <w:hyperlink r:id="rId153">
               <w:r>
                 <w:rPr>
                   <w:rStyle w:val="Hyperlink"/>
@@ -43322,7 +44086,7 @@
             <w:r>
               <w:t xml:space="preserve"> </w:t>
             </w:r>
-            <w:hyperlink r:id="rId153">
+            <w:hyperlink r:id="rId154">
               <w:r>
                 <w:rPr>
                   <w:rStyle w:val="Hyperlink"/>
@@ -43570,8 +44334,8 @@
         <w:t xml:space="preserve">The gap MAYA occupies is the seam: feature stores hold the data but not the governance, MRM tools hold the governance but not the data, and the in-house platforms hold both but cost a decade. MAYA is the buyable middle — governed, reproducible, and deliberately not a serving engine.</w:t>
       </w:r>
     </w:p>
-    <w:bookmarkEnd w:id="154"/>
-    <w:bookmarkStart w:id="155" w:name="head-to-head"/>
+    <w:bookmarkEnd w:id="155"/>
+    <w:bookmarkStart w:id="156" w:name="head-to-head"/>
     <w:p>
       <w:pPr>
         <w:pStyle w:val="Heading3"/>
@@ -44824,8 +45588,8 @@
         </w:tc>
       </w:tr>
     </w:tbl>
-    <w:bookmarkEnd w:id="155"/>
-    <w:bookmarkStart w:id="156" w:name="what-maya-takes-from-each"/>
+    <w:bookmarkEnd w:id="156"/>
+    <w:bookmarkStart w:id="157" w:name="what-maya-takes-from-each"/>
     <w:p>
       <w:pPr>
         <w:pStyle w:val="Heading3"/>
@@ -45429,8 +46193,8 @@
         </w:tc>
       </w:tr>
     </w:tbl>
-    <w:bookmarkEnd w:id="156"/>
-    <w:bookmarkStart w:id="164" w:name="where-maya-deliberately-loses"/>
+    <w:bookmarkEnd w:id="157"/>
+    <w:bookmarkStart w:id="165" w:name="where-maya-deliberately-loses"/>
     <w:p>
       <w:pPr>
         <w:pStyle w:val="Heading3"/>
@@ -45559,7 +46323,7 @@
       <w:r>
         <w:t xml:space="preserve"> </w:t>
       </w:r>
-      <w:hyperlink r:id="rId157">
+      <w:hyperlink r:id="rId158">
         <w:r>
           <w:rPr>
             <w:rStyle w:val="Hyperlink"/>
@@ -45576,7 +46340,7 @@
       <w:r>
         <w:t xml:space="preserve"> </w:t>
       </w:r>
-      <w:hyperlink r:id="rId158">
+      <w:hyperlink r:id="rId159">
         <w:r>
           <w:rPr>
             <w:rStyle w:val="Hyperlink"/>
@@ -45593,7 +46357,7 @@
       <w:r>
         <w:t xml:space="preserve"> </w:t>
       </w:r>
-      <w:hyperlink r:id="rId159">
+      <w:hyperlink r:id="rId160">
         <w:r>
           <w:rPr>
             <w:rStyle w:val="Hyperlink"/>
@@ -45610,7 +46374,7 @@
       <w:r>
         <w:t xml:space="preserve"> </w:t>
       </w:r>
-      <w:hyperlink r:id="rId160">
+      <w:hyperlink r:id="rId161">
         <w:r>
           <w:rPr>
             <w:rStyle w:val="Hyperlink"/>
@@ -45627,7 +46391,7 @@
       <w:r>
         <w:t xml:space="preserve"> </w:t>
       </w:r>
-      <w:hyperlink r:id="rId161">
+      <w:hyperlink r:id="rId162">
         <w:r>
           <w:rPr>
             <w:rStyle w:val="Hyperlink"/>
@@ -45644,7 +46408,7 @@
       <w:r>
         <w:t xml:space="preserve"> </w:t>
       </w:r>
-      <w:hyperlink r:id="rId162">
+      <w:hyperlink r:id="rId163">
         <w:r>
           <w:rPr>
             <w:rStyle w:val="Hyperlink"/>
@@ -45661,7 +46425,7 @@
       <w:r>
         <w:t xml:space="preserve"> </w:t>
       </w:r>
-      <w:hyperlink r:id="rId163">
+      <w:hyperlink r:id="rId164">
         <w:r>
           <w:rPr>
             <w:rStyle w:val="Hyperlink"/>
@@ -45670,9 +46434,9 @@
         </w:r>
       </w:hyperlink>
     </w:p>
-    <w:bookmarkEnd w:id="164"/>
     <w:bookmarkEnd w:id="165"/>
-    <w:bookmarkStart w:id="177" w:name="critical-review-of-this-design"/>
+    <w:bookmarkEnd w:id="166"/>
+    <w:bookmarkStart w:id="178" w:name="critical-review-of-this-design"/>
     <w:p>
       <w:pPr>
         <w:pStyle w:val="Heading2"/>
@@ -45689,7 +46453,7 @@
         <w:t xml:space="preserve">Sections 1–26 describe a coherent system. Read adversarially, it has eleven real weaknesses. Each is stated plainly, with the change made in response; where the change is structural it must land in Phase 0 or 1, because retrofitting is either impossible or a rewrite.</w:t>
       </w:r>
     </w:p>
-    <w:bookmarkStart w:id="166" w:name="the-platform-is-easy-to-route-around"/>
+    <w:bookmarkStart w:id="167" w:name="the-platform-is-easy-to-route-around"/>
     <w:p>
       <w:pPr>
         <w:pStyle w:val="Heading3"/>
@@ -45796,8 +46560,8 @@
         <w:t xml:space="preserve">gives a typed, resolvable, shareable feature in one command — and only then to make the governed path worth taking. Ceremony scales with consequence: a scratch feature has none, a production execution warrant has all of it.</w:t>
       </w:r>
     </w:p>
-    <w:bookmarkEnd w:id="166"/>
-    <w:bookmarkStart w:id="167" w:name="Xee1292276164dd84c3fcdd0e08d897b5bbeb8e5"/>
+    <w:bookmarkEnd w:id="167"/>
+    <w:bookmarkStart w:id="168" w:name="Xee1292276164dd84c3fcdd0e08d897b5bbeb8e5"/>
     <w:p>
       <w:pPr>
         <w:pStyle w:val="Heading3"/>
@@ -45883,8 +46647,8 @@
         <w:t xml:space="preserve">: every row carries an event time and a knowledge time (the instant MAYA could first have known the value), and every resolution declares an as-of-known instant, defaulting to the pin’s as-of date. Details in §29.1.</w:t>
       </w:r>
     </w:p>
-    <w:bookmarkEnd w:id="167"/>
-    <w:bookmarkStart w:id="168" w:name="change-has-no-safe-rehearsal-space"/>
+    <w:bookmarkEnd w:id="168"/>
+    <w:bookmarkStart w:id="169" w:name="change-has-no-safe-rehearsal-space"/>
     <w:p>
       <w:pPr>
         <w:pStyle w:val="Heading3"/>
@@ -45961,8 +46725,8 @@
         <w:t xml:space="preserve">— a copy-on-write branch of the catalog, borrowed from Iceberg and lakeFS. Inside a workspace a designer edits definitions, resolves against them, and runs the shadow replay of §29.2; the review screen shows the branch diff and the numeric impact; approval is a merge. Workspaces are cheap because nothing is copied until it is written, and they give the platform its write-audit-publish story.</w:t>
       </w:r>
     </w:p>
-    <w:bookmarkEnd w:id="168"/>
-    <w:bookmarkStart w:id="169" w:name="cascade-pins-will-multiply-storage"/>
+    <w:bookmarkEnd w:id="169"/>
+    <w:bookmarkStart w:id="170" w:name="cascade-pins-will-multiply-storage"/>
     <w:p>
       <w:pPr>
         <w:pStyle w:val="Heading3"/>
@@ -46023,8 +46787,8 @@
         <w:t xml:space="preserve">(§29.3): a pin is a manifest of immutable fragments, fragments are shared across pins that contain the same bytes, and only genuinely changed data is written. A month-end pin of a slow-moving feature costs its delta, not its size.</w:t>
       </w:r>
     </w:p>
-    <w:bookmarkEnd w:id="169"/>
-    <w:bookmarkStart w:id="170" w:name="the-warrant-stops-at-the-door"/>
+    <w:bookmarkEnd w:id="170"/>
+    <w:bookmarkStart w:id="171" w:name="the-warrant-stops-at-the-door"/>
     <w:p>
       <w:pPr>
         <w:pStyle w:val="Heading3"/>
@@ -46113,8 +46877,8 @@
         <w:t xml:space="preserve">on the warrant, so the weaker mode is visible rather than assumed.</w:t>
       </w:r>
     </w:p>
-    <w:bookmarkEnd w:id="170"/>
-    <w:bookmarkStart w:id="171" w:name="the-formula-ir-asks-a-lot-of-its-authors"/>
+    <w:bookmarkEnd w:id="171"/>
+    <w:bookmarkStart w:id="172" w:name="the-formula-ir-asks-a-lot-of-its-authors"/>
     <w:p>
       <w:pPr>
         <w:pStyle w:val="Heading3"/>
@@ -46172,8 +46936,8 @@
         <w:t xml:space="preserve">: parsed from LaTeX, lifted from Python via AST analysis of the uploaded artifact, extracted from an Excel workbook (§29.9), or drafted by the assistant of §29.8 and corrected by the author. The IR then earns its place by doing work the author wants — type checking against the feature set, automatic document rendering, semantic diffs, and the conformance testing of §29.7.</w:t>
       </w:r>
     </w:p>
-    <w:bookmarkEnd w:id="171"/>
-    <w:bookmarkStart w:id="172" w:name="X5efaff1aeec80dc29fb0e8afa37482e55f464df"/>
+    <w:bookmarkEnd w:id="172"/>
+    <w:bookmarkStart w:id="173" w:name="X5efaff1aeec80dc29fb0e8afa37482e55f464df"/>
     <w:p>
       <w:pPr>
         <w:pStyle w:val="Heading3"/>
@@ -46249,8 +47013,8 @@
         <w:t xml:space="preserve">re-executes and compares outputs, not just inputs. Where re-execution is impossible — a black-box vendor model — the bundle says so explicitly instead of implying a verification it cannot perform.</w:t>
       </w:r>
     </w:p>
-    <w:bookmarkEnd w:id="172"/>
-    <w:bookmarkStart w:id="173" w:name="Xe946cdb1bad5067c84d525f85599d649831f69e"/>
+    <w:bookmarkEnd w:id="173"/>
+    <w:bookmarkStart w:id="174" w:name="Xe946cdb1bad5067c84d525f85599d649831f69e"/>
     <w:p>
       <w:pPr>
         <w:pStyle w:val="Heading3"/>
@@ -46311,8 +47075,8 @@
         <w:t xml:space="preserve">of a derivation’s operands (§29.6). Exports and warrants that would breach terms are blocked with the clause named.</w:t>
       </w:r>
     </w:p>
-    <w:bookmarkEnd w:id="173"/>
-    <w:bookmarkStart w:id="174" w:name="eight-roles-is-more-than-most-teams-have"/>
+    <w:bookmarkEnd w:id="174"/>
+    <w:bookmarkStart w:id="175" w:name="eight-roles-is-more-than-most-teams-have"/>
     <w:p>
       <w:pPr>
         <w:pStyle w:val="Heading3"/>
@@ -46460,8 +47224,8 @@
         <w:t xml:space="preserve">, and the UI states which is active on every review screen.</w:t>
       </w:r>
     </w:p>
-    <w:bookmarkEnd w:id="174"/>
-    <w:bookmarkStart w:id="175" w:name="X36cf1652d1e16973ca6a916dbfa3b288527273a"/>
+    <w:bookmarkEnd w:id="175"/>
+    <w:bookmarkStart w:id="176" w:name="X36cf1652d1e16973ca6a916dbfa3b288527273a"/>
     <w:p>
       <w:pPr>
         <w:pStyle w:val="Heading3"/>
@@ -46521,8 +47285,8 @@
         <w:t xml:space="preserve">The line limit stays as a cheap smoke alarm, but the real gates are the ones that constrain structure: the import-linter boundaries of §14, a maximum public-symbol count per module, cyclomatic complexity, and a dependency-cycle check. A module that passes those and exceeds the line count needs a note; a module that fails them fails the build regardless of length.</w:t>
       </w:r>
     </w:p>
-    <w:bookmarkEnd w:id="175"/>
-    <w:bookmarkStart w:id="176" w:name="remaining-honest-risks"/>
+    <w:bookmarkEnd w:id="176"/>
+    <w:bookmarkStart w:id="177" w:name="remaining-honest-risks"/>
     <w:p>
       <w:pPr>
         <w:pStyle w:val="Heading3"/>
@@ -46600,9 +47364,9 @@
         <w:t xml:space="preserve">, which the platform cannot create — the first two namespaces must be seeded by whoever sponsors the build, or the catalog is an empty shop.</w:t>
       </w:r>
     </w:p>
-    <w:bookmarkEnd w:id="176"/>
     <w:bookmarkEnd w:id="177"/>
-    <w:bookmarkStart w:id="189" w:name="maya-innovations"/>
+    <w:bookmarkEnd w:id="178"/>
+    <w:bookmarkStart w:id="190" w:name="maya-innovations"/>
     <w:p>
       <w:pPr>
         <w:pStyle w:val="Heading2"/>
@@ -46619,7 +47383,7 @@
         <w:t xml:space="preserve">Ten ideas that no product in §27 offers, each specified enough to build and honest about its cost. They are ordered by how early they must land: 29.1 to 29.3 are structural and belong in Phase 1, the rest layer on.</w:t>
       </w:r>
     </w:p>
-    <w:bookmarkStart w:id="178" w:name="X5b798d41100fc32293ca71e8fa3f645c4a40c39"/>
+    <w:bookmarkStart w:id="179" w:name="X5b798d41100fc32293ca71e8fa3f645c4a40c39"/>
     <w:p>
       <w:pPr>
         <w:pStyle w:val="Heading3"/>
@@ -46795,8 +47559,8 @@
         <w:t xml:space="preserve">Two extra columns in every table, a second index dimension, and roughly 20–30% more storage. It must be in the schema from Phase 1.</w:t>
       </w:r>
     </w:p>
-    <w:bookmarkEnd w:id="178"/>
-    <w:bookmarkStart w:id="179" w:name="shadow-replay-numeric-impact-analysis"/>
+    <w:bookmarkEnd w:id="179"/>
+    <w:bookmarkStart w:id="180" w:name="shadow-replay-numeric-impact-analysis"/>
     <w:p>
       <w:pPr>
         <w:pStyle w:val="Heading3"/>
@@ -46919,8 +47683,8 @@
         <w:t xml:space="preserve">) — with the sample size, and the share of the population it covers, stated on the report. The sample is the most recent rows of each index rather than a random draw, which is a recency bias and is said so rather than left to be discovered.</w:t>
       </w:r>
     </w:p>
-    <w:bookmarkEnd w:id="179"/>
-    <w:bookmarkStart w:id="180" w:name="content-addressed-materialization"/>
+    <w:bookmarkEnd w:id="180"/>
+    <w:bookmarkStart w:id="181" w:name="content-addressed-materialization"/>
     <w:p>
       <w:pPr>
         <w:pStyle w:val="Heading3"/>
@@ -46976,8 +47740,8 @@
         <w:t xml:space="preserve">A fragment index and a garbage collector that is provably safe against sealed pins. Fragment boundaries must be chosen by content (rolling hash over the index), not by row count, or a single inserted row invalidates everything downstream.</w:t>
       </w:r>
     </w:p>
-    <w:bookmarkEnd w:id="180"/>
-    <w:bookmarkStart w:id="181" w:name="escrowed-holdout-and-blind-scoring"/>
+    <w:bookmarkEnd w:id="181"/>
+    <w:bookmarkStart w:id="182" w:name="escrowed-holdout-and-blind-scoring"/>
     <w:p>
       <w:pPr>
         <w:pStyle w:val="Heading3"/>
@@ -47033,8 +47797,8 @@
         <w:t xml:space="preserve">MAYA must execute scoring, which is a narrow, well-bounded step into the runtime it otherwise avoids — the sandbox of §17.2 already does exactly this work.</w:t>
       </w:r>
     </w:p>
-    <w:bookmarkEnd w:id="181"/>
-    <w:bookmarkStart w:id="182" w:name="warrants-with-covenants"/>
+    <w:bookmarkEnd w:id="182"/>
+    <w:bookmarkStart w:id="183" w:name="warrants-with-covenants"/>
     <w:p>
       <w:pPr>
         <w:pStyle w:val="Heading3"/>
@@ -47102,8 +47866,8 @@
         <w:t xml:space="preserve">A monitoring loop and a clear false-positive story; covenants are opt-in per warrant, with recommended defaults that start loose.</w:t>
       </w:r>
     </w:p>
-    <w:bookmarkEnd w:id="182"/>
-    <w:bookmarkStart w:id="183" w:name="X880304889736beb8cb7c1b6c42a33d26548e733"/>
+    <w:bookmarkEnd w:id="183"/>
+    <w:bookmarkStart w:id="184" w:name="X880304889736beb8cb7c1b6c42a33d26548e733"/>
     <w:p>
       <w:pPr>
         <w:pStyle w:val="Heading3"/>
@@ -47202,8 +47966,8 @@
         <w:t xml:space="preserve">Licence modelling needs legal input to get the vocabulary right; anchoring needs one external dependency and an offline verification path.</w:t>
       </w:r>
     </w:p>
-    <w:bookmarkEnd w:id="183"/>
-    <w:bookmarkStart w:id="184" w:name="spec-code-conformance-testing"/>
+    <w:bookmarkEnd w:id="184"/>
+    <w:bookmarkStart w:id="185" w:name="spec-code-conformance-testing"/>
     <w:p>
       <w:pPr>
         <w:pStyle w:val="Heading3"/>
@@ -47323,8 +48087,8 @@
         <w:t xml:space="preserve">An interpreter for the IR, and honesty about coverage — sampled agreement is not proof, and the report says so.</w:t>
       </w:r>
     </w:p>
-    <w:bookmarkEnd w:id="184"/>
-    <w:bookmarkStart w:id="185" w:name="the-assistant-as-a-recorded-challenger"/>
+    <w:bookmarkEnd w:id="185"/>
+    <w:bookmarkStart w:id="186" w:name="the-assistant-as-a-recorded-challenger"/>
     <w:p>
       <w:pPr>
         <w:pStyle w:val="Heading3"/>
@@ -47383,8 +48147,8 @@
         <w:t xml:space="preserve">Prompt and output governance, a strict no-write boundary, and resistance to the temptation to let it approve anything.</w:t>
       </w:r>
     </w:p>
-    <w:bookmarkEnd w:id="185"/>
-    <w:bookmarkStart w:id="186" w:name="spreadsheets-as-first-class-models"/>
+    <w:bookmarkEnd w:id="186"/>
+    <w:bookmarkStart w:id="187" w:name="spreadsheets-as-first-class-models"/>
     <w:p>
       <w:pPr>
         <w:pStyle w:val="Heading3"/>
@@ -47427,8 +48191,8 @@
         <w:t xml:space="preserve">Excel’s semantics are broad; scope v1 to arithmetic, standard functions, named ranges and simple lookups, and refuse the rest loudly rather than approximating it.</w:t>
       </w:r>
     </w:p>
-    <w:bookmarkEnd w:id="186"/>
-    <w:bookmarkStart w:id="187" w:name="vendor-models-under-the-same-wrapper"/>
+    <w:bookmarkEnd w:id="187"/>
+    <w:bookmarkStart w:id="188" w:name="vendor-models-under-the-same-wrapper"/>
     <w:p>
       <w:pPr>
         <w:pStyle w:val="Heading3"/>
@@ -47463,8 +48227,8 @@
         <w:t xml:space="preserve">Low to build, high in value: it makes the inventory complete, and completeness is what an examiner actually asks for.</w:t>
       </w:r>
     </w:p>
-    <w:bookmarkEnd w:id="187"/>
-    <w:bookmarkStart w:id="188" w:name="what-these-change-about-the-roadmap"/>
+    <w:bookmarkEnd w:id="188"/>
+    <w:bookmarkStart w:id="189" w:name="what-these-change-about-the-roadmap"/>
     <w:p>
       <w:pPr>
         <w:pStyle w:val="Heading3"/>
@@ -47481,9 +48245,9 @@
         <w:t xml:space="preserve">Three of the ten are structural. Bitemporality (§29.1) and content-addressed materialization (§29.3) must land inside Phase 1 or never; workspaces (§28.3) must land with Phase 3 workflow, since approval-as-merge is hard to retrofit onto an approval-as-button design. The rest — shadow replay, escrowed holdout, covenants, licence algebra, conformance testing, the assistant, spreadsheet import, vendor models — are additive and belong in Phases 4 to 6 in roughly that order, each behind a feature flag so the core platform ships without waiting for them.</w:t>
       </w:r>
     </w:p>
-    <w:bookmarkEnd w:id="188"/>
     <w:bookmarkEnd w:id="189"/>
-    <w:bookmarkStart w:id="193" w:name="appendices"/>
+    <w:bookmarkEnd w:id="190"/>
+    <w:bookmarkStart w:id="194" w:name="appendices"/>
     <w:p>
       <w:pPr>
         <w:pStyle w:val="Heading2"/>
@@ -47492,7 +48256,7 @@
         <w:t xml:space="preserve">30. Appendices</w:t>
       </w:r>
     </w:p>
-    <w:bookmarkStart w:id="190" w:name="a.-core-schema-outline"/>
+    <w:bookmarkStart w:id="191" w:name="a.-core-schema-outline"/>
     <w:p>
       <w:pPr>
         <w:pStyle w:val="Heading3"/>
@@ -48355,8 +49119,8 @@
         </w:tc>
       </w:tr>
     </w:tbl>
-    <w:bookmarkEnd w:id="190"/>
-    <w:bookmarkStart w:id="191" w:name="b.-permission-levels"/>
+    <w:bookmarkEnd w:id="191"/>
+    <w:bookmarkStart w:id="192" w:name="b.-permission-levels"/>
     <w:p>
       <w:pPr>
         <w:pStyle w:val="Heading3"/>
@@ -48916,8 +49680,8 @@
         <w:t xml:space="preserve">Every cell is additionally gated by the role ceiling in section 11.2.</w:t>
       </w:r>
     </w:p>
-    <w:bookmarkEnd w:id="191"/>
-    <w:bookmarkStart w:id="192" w:name="c.-glossary"/>
+    <w:bookmarkEnd w:id="192"/>
+    <w:bookmarkStart w:id="193" w:name="c.-glossary"/>
     <w:p>
       <w:pPr>
         <w:pStyle w:val="Heading3"/>
@@ -49424,9 +50188,9 @@
         <w:t xml:space="preserve">— a copy-on-write branch of the catalog in which a change is rehearsed.</w:t>
       </w:r>
     </w:p>
-    <w:bookmarkEnd w:id="192"/>
     <w:bookmarkEnd w:id="193"/>
     <w:bookmarkEnd w:id="194"/>
+    <w:bookmarkEnd w:id="195"/>
     <w:sectPr>
       <w:footnotePr>
         <w:numRestart w:val="eachSect"/>

</xml_diff>

<commit_message>
Admin → AI models: profiles from settings, file and database; switch the default at runtime; test a profile; add, edit and delete profiles
</commit_message>
<xml_diff>
--- a/docs/MAYA_Requirements_and_Design.docx
+++ b/docs/MAYA_Requirements_and_Design.docx
@@ -38112,6 +38112,130 @@
       </w:r>
       <w:r>
         <w:t xml:space="preserve">model’s facts and the audit log’s readers may not be entitled to them.</w:t>
+      </w:r>
+      <w:r>
+        <w:t xml:space="preserve"> </w:t>
+      </w:r>
+      <w:r>
+        <w:rPr>
+          <w:b/>
+          <w:bCs/>
+        </w:rPr>
+        <w:t xml:space="preserve">Admin → AI models</w:t>
+      </w:r>
+      <w:r>
+        <w:t xml:space="preserve"> </w:t>
+      </w:r>
+      <w:r>
+        <w:t xml:space="preserve">lists every</w:t>
+      </w:r>
+      <w:r>
+        <w:t xml:space="preserve"> </w:t>
+      </w:r>
+      <w:r>
+        <w:t xml:space="preserve">profile with its source (settings, file or database), provider, model and readiness, and every provider on</w:t>
+      </w:r>
+      <w:r>
+        <w:t xml:space="preserve"> </w:t>
+      </w:r>
+      <w:r>
+        <w:t xml:space="preserve">offer. An administrator may make a profile the</w:t>
+      </w:r>
+      <w:r>
+        <w:t xml:space="preserve"> </w:t>
+      </w:r>
+      <w:r>
+        <w:rPr>
+          <w:b/>
+          <w:bCs/>
+        </w:rPr>
+        <w:t xml:space="preserve">default</w:t>
+      </w:r>
+      <w:r>
+        <w:t xml:space="preserve"> </w:t>
+      </w:r>
+      <w:r>
+        <w:t xml:space="preserve">— stored as a runtime setting in the database,</w:t>
+      </w:r>
+      <w:r>
+        <w:t xml:space="preserve"> </w:t>
+      </w:r>
+      <w:r>
+        <w:t xml:space="preserve">so it takes effect at once for every process, audited, and taking precedence over</w:t>
+      </w:r>
+      <w:r>
+        <w:t xml:space="preserve"> </w:t>
+      </w:r>
+      <w:r>
+        <w:rPr>
+          <w:rStyle w:val="VerbatimChar"/>
+        </w:rPr>
+        <w:t xml:space="preserve">llm.profile</w:t>
+      </w:r>
+      <w:r>
+        <w:t xml:space="preserve"> </w:t>
+      </w:r>
+      <w:r>
+        <w:t xml:space="preserve">and the file’s</w:t>
+      </w:r>
+      <w:r>
+        <w:t xml:space="preserve"> </w:t>
+      </w:r>
+      <w:r>
+        <w:rPr>
+          <w:rStyle w:val="VerbatimChar"/>
+        </w:rPr>
+        <w:t xml:space="preserve">default:</w:t>
+      </w:r>
+      <w:r>
+        <w:t xml:space="preserve"> </w:t>
+      </w:r>
+      <w:r>
+        <w:t xml:space="preserve">until handed back —</w:t>
+      </w:r>
+      <w:r>
+        <w:t xml:space="preserve"> </w:t>
+      </w:r>
+      <w:r>
+        <w:rPr>
+          <w:b/>
+          <w:bCs/>
+        </w:rPr>
+        <w:t xml:space="preserve">test</w:t>
+      </w:r>
+      <w:r>
+        <w:t xml:space="preserve"> </w:t>
+      </w:r>
+      <w:r>
+        <w:t xml:space="preserve">a profile with a one-line prompt, and</w:t>
+      </w:r>
+      <w:r>
+        <w:t xml:space="preserve"> </w:t>
+      </w:r>
+      <w:r>
+        <w:rPr>
+          <w:b/>
+          <w:bCs/>
+        </w:rPr>
+        <w:t xml:space="preserve">add, edit or delete</w:t>
+      </w:r>
+      <w:r>
+        <w:t xml:space="preserve"> </w:t>
+      </w:r>
+      <w:r>
+        <w:t xml:space="preserve">profiles,</w:t>
+      </w:r>
+      <w:r>
+        <w:t xml:space="preserve"> </w:t>
+      </w:r>
+      <w:r>
+        <w:t xml:space="preserve">which are stored in the database and replace a file profile of the same name. A profile’s options may name</w:t>
+      </w:r>
+      <w:r>
+        <w:t xml:space="preserve"> </w:t>
+      </w:r>
+      <w:r>
+        <w:t xml:space="preserve">the environment variable that holds a key and are refused if they appear to hold one.</w:t>
       </w:r>
     </w:p>
     <w:p>

</xml_diff>

<commit_message>
Restatement alerts: when data under a live model's training pin is corrected, measure the rows changed, score the approved parameters on the holdout both ways, measure the prediction shift, notify the owners and hold it open until acknowledged
</commit_message>
<xml_diff>
--- a/docs/MAYA_Requirements_and_Design.docx
+++ b/docs/MAYA_Requirements_and_Design.docx
@@ -38498,6 +38498,271 @@
         <w:t xml:space="preserve">.</w:t>
       </w:r>
     </w:p>
+    <w:p>
+      <w:pPr>
+        <w:pStyle w:val="BodyText"/>
+      </w:pPr>
+      <w:r>
+        <w:rPr>
+          <w:b/>
+          <w:bCs/>
+        </w:rPr>
+        <w:t xml:space="preserve">Every language-model call goes through the gateway.</w:t>
+      </w:r>
+      <w:r>
+        <w:t xml:space="preserve"> </w:t>
+      </w:r>
+      <w:r>
+        <w:t xml:space="preserve">The recorded challenger (§29.8) asks through it when</w:t>
+      </w:r>
+      <w:r>
+        <w:t xml:space="preserve"> </w:t>
+      </w:r>
+      <w:r>
+        <w:rPr>
+          <w:rStyle w:val="VerbatimChar"/>
+        </w:rPr>
+        <w:t xml:space="preserve">assistant.provider</w:t>
+      </w:r>
+      <w:r>
+        <w:t xml:space="preserve"> </w:t>
+      </w:r>
+      <w:r>
+        <w:t xml:space="preserve">is</w:t>
+      </w:r>
+      <w:r>
+        <w:t xml:space="preserve"> </w:t>
+      </w:r>
+      <w:r>
+        <w:rPr>
+          <w:rStyle w:val="VerbatimChar"/>
+        </w:rPr>
+        <w:t xml:space="preserve">llm</w:t>
+      </w:r>
+      <w:r>
+        <w:t xml:space="preserve">, with the profile</w:t>
+      </w:r>
+      <w:r>
+        <w:t xml:space="preserve"> </w:t>
+      </w:r>
+      <w:r>
+        <w:rPr>
+          <w:rStyle w:val="VerbatimChar"/>
+        </w:rPr>
+        <w:t xml:space="preserve">assistant.profile</w:t>
+      </w:r>
+      <w:r>
+        <w:t xml:space="preserve"> </w:t>
+      </w:r>
+      <w:r>
+        <w:t xml:space="preserve">names or the default, so switching the</w:t>
+      </w:r>
+      <w:r>
+        <w:t xml:space="preserve"> </w:t>
+      </w:r>
+      <w:r>
+        <w:t xml:space="preserve">default in Admin → AI models moves the challenger too; a provider that cannot enforce a schema is asked for</w:t>
+      </w:r>
+      <w:r>
+        <w:t xml:space="preserve"> </w:t>
+      </w:r>
+      <w:r>
+        <w:t xml:space="preserve">one JSON object and its reply is checked, a finding of an unknown severity or category being dropped</w:t>
+      </w:r>
+      <w:r>
+        <w:t xml:space="preserve"> </w:t>
+      </w:r>
+      <w:r>
+        <w:t xml:space="preserve">(</w:t>
+      </w:r>
+      <w:r>
+        <w:rPr>
+          <w:rStyle w:val="VerbatimChar"/>
+        </w:rPr>
+        <w:t xml:space="preserve">claude</w:t>
+      </w:r>
+      <w:r>
+        <w:t xml:space="preserve"> </w:t>
+      </w:r>
+      <w:r>
+        <w:t xml:space="preserve">keeps its direct, schema-enforced Anthropic call). A</w:t>
+      </w:r>
+      <w:r>
+        <w:t xml:space="preserve"> </w:t>
+      </w:r>
+      <w:r>
+        <w:rPr>
+          <w:b/>
+          <w:bCs/>
+        </w:rPr>
+        <w:t xml:space="preserve">live evaluation</w:t>
+      </w:r>
+      <w:r>
+        <w:t xml:space="preserve"> </w:t>
+      </w:r>
+      <w:r>
+        <w:t xml:space="preserve">of an LLM application</w:t>
+      </w:r>
+      <w:r>
+        <w:t xml:space="preserve"> </w:t>
+      </w:r>
+      <w:r>
+        <w:t xml:space="preserve">is different in kind: the version’s provider and model are part of what is approved, so the gateway asks</w:t>
+      </w:r>
+      <w:r>
+        <w:t xml:space="preserve"> </w:t>
+      </w:r>
+      <w:r>
+        <w:t xml:space="preserve">exactly that pairing, with the version’s own</w:t>
+      </w:r>
+      <w:r>
+        <w:t xml:space="preserve"> </w:t>
+      </w:r>
+      <w:r>
+        <w:rPr>
+          <w:rStyle w:val="VerbatimChar"/>
+        </w:rPr>
+        <w:t xml:space="preserve">max_tokens</w:t>
+      </w:r>
+      <w:r>
+        <w:t xml:space="preserve"> </w:t>
+      </w:r>
+      <w:r>
+        <w:t xml:space="preserve">and temperature (none means the provider’s own),</w:t>
+      </w:r>
+      <w:r>
+        <w:t xml:space="preserve"> </w:t>
+      </w:r>
+      <w:r>
+        <w:t xml:space="preserve">and never the switchable default.</w:t>
+      </w:r>
+      <w:r>
+        <w:t xml:space="preserve"> </w:t>
+      </w:r>
+      <w:r>
+        <w:rPr>
+          <w:rStyle w:val="VerbatimChar"/>
+        </w:rPr>
+        <w:t xml:space="preserve">anthropic</w:t>
+      </w:r>
+      <w:r>
+        <w:t xml:space="preserve">,</w:t>
+      </w:r>
+      <w:r>
+        <w:t xml:space="preserve"> </w:t>
+      </w:r>
+      <w:r>
+        <w:rPr>
+          <w:rStyle w:val="VerbatimChar"/>
+        </w:rPr>
+        <w:t xml:space="preserve">openai</w:t>
+      </w:r>
+      <w:r>
+        <w:t xml:space="preserve">,</w:t>
+      </w:r>
+      <w:r>
+        <w:t xml:space="preserve"> </w:t>
+      </w:r>
+      <w:r>
+        <w:rPr>
+          <w:rStyle w:val="VerbatimChar"/>
+        </w:rPr>
+        <w:t xml:space="preserve">azure_openai</w:t>
+      </w:r>
+      <w:r>
+        <w:t xml:space="preserve">,</w:t>
+      </w:r>
+      <w:r>
+        <w:t xml:space="preserve"> </w:t>
+      </w:r>
+      <w:r>
+        <w:rPr>
+          <w:rStyle w:val="VerbatimChar"/>
+        </w:rPr>
+        <w:t xml:space="preserve">bedrock</w:t>
+      </w:r>
+      <w:r>
+        <w:t xml:space="preserve"> </w:t>
+      </w:r>
+      <w:r>
+        <w:t xml:space="preserve">and</w:t>
+      </w:r>
+      <w:r>
+        <w:t xml:space="preserve"> </w:t>
+      </w:r>
+      <w:r>
+        <w:rPr>
+          <w:rStyle w:val="VerbatimChar"/>
+        </w:rPr>
+        <w:t xml:space="preserve">ollama</w:t>
+      </w:r>
+      <w:r>
+        <w:t xml:space="preserve"> </w:t>
+      </w:r>
+      <w:r>
+        <w:t xml:space="preserve">can be run</w:t>
+      </w:r>
+      <w:r>
+        <w:t xml:space="preserve"> </w:t>
+      </w:r>
+      <w:r>
+        <w:t xml:space="preserve">live; any other provider is evaluated by a recorded run. Each call is audited as</w:t>
+      </w:r>
+      <w:r>
+        <w:t xml:space="preserve"> </w:t>
+      </w:r>
+      <w:r>
+        <w:rPr>
+          <w:rStyle w:val="VerbatimChar"/>
+        </w:rPr>
+        <w:t xml:space="preserve">ai.completion</w:t>
+      </w:r>
+      <w:r>
+        <w:t xml:space="preserve"> </w:t>
+      </w:r>
+      <w:r>
+        <w:t xml:space="preserve">with its</w:t>
+      </w:r>
+      <w:r>
+        <w:t xml:space="preserve"> </w:t>
+      </w:r>
+      <w:r>
+        <w:t xml:space="preserve">purpose (</w:t>
+      </w:r>
+      <w:r>
+        <w:rPr>
+          <w:rStyle w:val="VerbatimChar"/>
+        </w:rPr>
+        <w:t xml:space="preserve">assistant.challenge</w:t>
+      </w:r>
+      <w:r>
+        <w:t xml:space="preserve">,</w:t>
+      </w:r>
+      <w:r>
+        <w:t xml:space="preserve"> </w:t>
+      </w:r>
+      <w:r>
+        <w:rPr>
+          <w:rStyle w:val="VerbatimChar"/>
+        </w:rPr>
+        <w:t xml:space="preserve">llm.evaluation</w:t>
+      </w:r>
+      <w:r>
+        <w:t xml:space="preserve">, a document section,</w:t>
+      </w:r>
+      <w:r>
+        <w:t xml:space="preserve"> </w:t>
+      </w:r>
+      <w:r>
+        <w:rPr>
+          <w:rStyle w:val="VerbatimChar"/>
+        </w:rPr>
+        <w:t xml:space="preserve">ai.test</w:t>
+      </w:r>
+      <w:r>
+        <w:t xml:space="preserve">).</w:t>
+      </w:r>
+    </w:p>
     <w:bookmarkEnd w:id="132"/>
     <w:bookmarkEnd w:id="133"/>
     <w:bookmarkStart w:id="138" w:name="engineering-standards"/>
@@ -47681,6 +47946,158 @@
       </w:r>
       <w:r>
         <w:t xml:space="preserve">Two extra columns in every table, a second index dimension, and roughly 20–30% more storage. It must be in the schema from Phase 1.</w:t>
+      </w:r>
+    </w:p>
+    <w:p>
+      <w:pPr>
+        <w:pStyle w:val="BodyText"/>
+      </w:pPr>
+      <w:r>
+        <w:rPr>
+          <w:b/>
+          <w:bCs/>
+        </w:rPr>
+        <w:t xml:space="preserve">Restatement alerts</w:t>
+      </w:r>
+      <w:r>
+        <w:t xml:space="preserve"> </w:t>
+      </w:r>
+      <w:r>
+        <w:t xml:space="preserve">(</w:t>
+      </w:r>
+      <w:r>
+        <w:rPr>
+          <w:i/>
+          <w:iCs/>
+        </w:rPr>
+        <w:t xml:space="preserve">Revision 2.8</w:t>
+      </w:r>
+      <w:r>
+        <w:t xml:space="preserve">). Keeping pins still has a cost of its own: a model fitted on a pin goes on running on what the pin says after the source has corrected it. So a restatement is acted on as well as recorded. Every ingest that restates rows queues a job, which checks each live (or suspended) execution warrant. It resolves the definition of the feature set pin that warrant’s training warrant was drawn on again, over the same member feature</w:t>
+      </w:r>
+      <w:r>
+        <w:t xml:space="preserve"> </w:t>
+      </w:r>
+      <w:r>
+        <w:rPr>
+          <w:i/>
+          <w:iCs/>
+        </w:rPr>
+        <w:t xml:space="preserve">versions</w:t>
+      </w:r>
+      <w:r>
+        <w:t xml:space="preserve"> </w:t>
+      </w:r>
+      <w:r>
+        <w:t xml:space="preserve">and to the same as-of date, with everything known now. If that hashes the same as the sealed pin, nothing under the model moved and nothing is said. If it differs, MAYA records an</w:t>
+      </w:r>
+      <w:r>
+        <w:t xml:space="preserve"> </w:t>
+      </w:r>
+      <w:r>
+        <w:rPr>
+          <w:b/>
+          <w:bCs/>
+        </w:rPr>
+        <w:t xml:space="preserve">impact</w:t>
+      </w:r>
+      <w:r>
+        <w:t xml:space="preserve"> </w:t>
+      </w:r>
+      <w:r>
+        <w:t xml:space="preserve">on the warrant, with no row shown to anyone:</w:t>
+      </w:r>
+    </w:p>
+    <w:p>
+      <w:pPr>
+        <w:pStyle w:val="Compact"/>
+        <w:numPr>
+          <w:ilvl w:val="0"/>
+          <w:numId w:val="1026"/>
+        </w:numPr>
+      </w:pPr>
+      <w:r>
+        <w:t xml:space="preserve">the rows changed (and how many of them fall in the escrowed holdout), added and dropped;</w:t>
+      </w:r>
+    </w:p>
+    <w:p>
+      <w:pPr>
+        <w:pStyle w:val="Compact"/>
+        <w:numPr>
+          <w:ilvl w:val="0"/>
+          <w:numId w:val="1026"/>
+        </w:numPr>
+      </w:pPr>
+      <w:r>
+        <w:t xml:space="preserve">the warrant’s approved parameters scored on the holdout both ways, from the IR or in the sandbox, as blind scoring does (this is MAYA’s own check, so no holdout attempt is spent);</w:t>
+      </w:r>
+    </w:p>
+    <w:p>
+      <w:pPr>
+        <w:pStyle w:val="Compact"/>
+        <w:numPr>
+          <w:ilvl w:val="0"/>
+          <w:numId w:val="1026"/>
+        </w:numPr>
+      </w:pPr>
+      <w:r>
+        <w:t xml:space="preserve">the prediction shift over every row: its mean and its largest absolute value, and the share of rows that moved.</w:t>
+      </w:r>
+    </w:p>
+    <w:p>
+      <w:pPr>
+        <w:pStyle w:val="FirstParagraph"/>
+      </w:pPr>
+      <w:r>
+        <w:t xml:space="preserve">The warrant’s owner, the model’s owner and every model manager are notified. The impact stays open on the warrant’s page until one of them acknowledges it with a note, either that the model was refitted or why the change is immaterial. Nothing is suspended automatically, because whether a correction invalidates a model is a judgement; the impact is the evidence for making it. The same corrected state is never reported twice, and an owner can ask for a check at any time (</w:t>
+      </w:r>
+      <w:r>
+        <w:rPr>
+          <w:rStyle w:val="VerbatimChar"/>
+        </w:rPr>
+        <w:t xml:space="preserve">GET /warrants/execution/{id}/restatements</w:t>
+      </w:r>
+      <w:r>
+        <w:t xml:space="preserve">,</w:t>
+      </w:r>
+      <w:r>
+        <w:t xml:space="preserve"> </w:t>
+      </w:r>
+      <w:r>
+        <w:rPr>
+          <w:rStyle w:val="VerbatimChar"/>
+        </w:rPr>
+        <w:t xml:space="preserve">POST …/restatements/check</w:t>
+      </w:r>
+      <w:r>
+        <w:t xml:space="preserve">,</w:t>
+      </w:r>
+      <w:r>
+        <w:t xml:space="preserve"> </w:t>
+      </w:r>
+      <w:r>
+        <w:rPr>
+          <w:rStyle w:val="VerbatimChar"/>
+        </w:rPr>
+        <w:t xml:space="preserve">POST /restatements/{id}/acknowledge</w:t>
+      </w:r>
+      <w:r>
+        <w:t xml:space="preserve">). The setting</w:t>
+      </w:r>
+      <w:r>
+        <w:t xml:space="preserve"> </w:t>
+      </w:r>
+      <w:r>
+        <w:rPr>
+          <w:rStyle w:val="VerbatimChar"/>
+        </w:rPr>
+        <w:t xml:space="preserve">restatements.alerts</w:t>
+      </w:r>
+      <w:r>
+        <w:t xml:space="preserve"> </w:t>
+      </w:r>
+      <w:r>
+        <w:t xml:space="preserve">turns the automatic check off.</w:t>
       </w:r>
     </w:p>
     <w:bookmarkEnd w:id="179"/>
@@ -50932,6 +51349,9 @@
     <w:abstractNumId w:val="991"/>
   </w:num>
   <w:num w:numId="1025">
+    <w:abstractNumId w:val="991"/>
+  </w:num>
+  <w:num w:numId="1026">
     <w:abstractNumId w:val="991"/>
   </w:num>
 </w:numbering>

</xml_diff>

<commit_message>
Observability for model governance: warrant, review, finding, restatement, document and AI gateway metrics; governance alert rules with runbooks; Grafana dashboards for the platform and for model governance
</commit_message>
<xml_diff>
--- a/docs/MAYA_Requirements_and_Design.docx
+++ b/docs/MAYA_Requirements_and_Design.docx
@@ -36317,6 +36317,58 @@
       </w:r>
       <w:r>
         <w:t xml:space="preserve">(Prometheus): request rate, latency histograms and error rate per endpoint; job queue depth, wait time, run time and failure rate per job type; resolution rows and bytes per second; Delta file counts and small-file ratio per table; database pool utilization and slow-query count; cache hit rates; active sessions; authorization denials; pins created and bytes stored per namespace.</w:t>
+      </w:r>
+    </w:p>
+    <w:p>
+      <w:pPr>
+        <w:pStyle w:val="BodyText"/>
+      </w:pPr>
+      <w:r>
+        <w:rPr>
+          <w:i/>
+          <w:iCs/>
+        </w:rPr>
+        <w:t xml:space="preserve">Revision 2.8:</w:t>
+      </w:r>
+      <w:r>
+        <w:t xml:space="preserve"> </w:t>
+      </w:r>
+      <w:r>
+        <w:rPr>
+          <w:b/>
+          <w:bCs/>
+        </w:rPr>
+        <w:t xml:space="preserve">governance metrics</w:t>
+      </w:r>
+      <w:r>
+        <w:t xml:space="preserve">, alongside the platform’s. Gauges for execution warrants by status and those expiring within 7 and 30 days, training warrants and versions by state, models past periodic review by tier, open findings by severity, restatement impacts by state and the age of the oldest unacknowledged one, and documents by state. Counters for covenant breaches by kind, restatement impacts, and every AI gateway call by purpose, provider and outcome, with its tokens and a latency histogram. No label names an object, so the number of series is bounded.</w:t>
+      </w:r>
+      <w:r>
+        <w:t xml:space="preserve"> </w:t>
+      </w:r>
+      <w:r>
+        <w:rPr>
+          <w:rStyle w:val="VerbatimChar"/>
+        </w:rPr>
+        <w:t xml:space="preserve">config/prometheus/maya-governance.rules.yml</w:t>
+      </w:r>
+      <w:r>
+        <w:t xml:space="preserve"> </w:t>
+      </w:r>
+      <w:r>
+        <w:t xml:space="preserve">alerts on them, each alert with a runbook. Two Grafana dashboards, one for the platform and one for model governance, ship in</w:t>
+      </w:r>
+      <w:r>
+        <w:t xml:space="preserve"> </w:t>
+      </w:r>
+      <w:r>
+        <w:rPr>
+          <w:rStyle w:val="VerbatimChar"/>
+        </w:rPr>
+        <w:t xml:space="preserve">config/grafana/</w:t>
+      </w:r>
+      <w:r>
+        <w:t xml:space="preserve">.</w:t>
       </w:r>
     </w:p>
     <w:p>

</xml_diff>

<commit_message>
A model_validator role; periodic reviews need model_manager or model_validator; governance profile edits change only the fields sent; the MLflow live alias is decided per registered model; documents record every drafting provider and model; signing out always lands on the landing page, SAML and OIDC included; capability matrix in the access reference pinned to the code
</commit_message>
<xml_diff>
--- a/docs/MAYA_Requirements_and_Design.docx
+++ b/docs/MAYA_Requirements_and_Design.docx
@@ -3187,7 +3187,7 @@
         <w:pStyle w:val="FirstParagraph"/>
       </w:pPr>
       <w:r>
-        <w:t xml:space="preserve">MAYA ships eight roles, stored in the database, assignable many-to-many to a user, and extensible: an administrator can define a custom role as a named set of permissions. Roles grant</w:t>
+        <w:t xml:space="preserve">MAYA ships nine roles, stored in the database, assignable many-to-many to a user, and extensible: an administrator can define a custom role as a named set of permissions. Roles grant</w:t>
       </w:r>
       <w:r>
         <w:t xml:space="preserve"> </w:t>
@@ -3563,6 +3563,44 @@
               <w:rPr>
                 <w:rStyle w:val="VerbatimChar"/>
               </w:rPr>
+              <w:t xml:space="preserve">model_validator</w:t>
+            </w:r>
+          </w:p>
+        </w:tc>
+        <w:tc>
+          <w:tcPr/>
+          <w:p>
+            <w:pPr>
+              <w:pStyle w:val="Compact"/>
+            </w:pPr>
+            <w:r>
+              <w:t xml:space="preserve">Independent validation: findings and periodic reviews; approves nothing</w:t>
+            </w:r>
+          </w:p>
+        </w:tc>
+        <w:tc>
+          <w:tcPr/>
+          <w:p>
+            <w:pPr>
+              <w:pStyle w:val="Compact"/>
+            </w:pPr>
+            <w:r>
+              <w:t xml:space="preserve">Re-runs the blind score, raises a finding, records the annual review</w:t>
+            </w:r>
+          </w:p>
+        </w:tc>
+      </w:tr>
+      <w:tr>
+        <w:tc>
+          <w:tcPr/>
+          <w:p>
+            <w:pPr>
+              <w:pStyle w:val="Compact"/>
+            </w:pPr>
+            <w:r>
+              <w:rPr>
+                <w:rStyle w:val="VerbatimChar"/>
+              </w:rPr>
               <w:t xml:space="preserve">techops</w:t>
             </w:r>
           </w:p>
@@ -3617,15 +3655,16 @@
         <w:tblLook w:firstRow="1" w:lastRow="0" w:firstColumn="0" w:lastColumn="0" w:noHBand="0" w:noVBand="0" w:val="0020"/>
       </w:tblPr>
       <w:tblGrid>
-        <w:gridCol w:w="879"/>
-        <w:gridCol w:w="879"/>
-        <w:gridCol w:w="879"/>
-        <w:gridCol w:w="879"/>
-        <w:gridCol w:w="879"/>
-        <w:gridCol w:w="879"/>
-        <w:gridCol w:w="879"/>
-        <w:gridCol w:w="879"/>
-        <w:gridCol w:w="879"/>
+        <w:gridCol w:w="792"/>
+        <w:gridCol w:w="792"/>
+        <w:gridCol w:w="792"/>
+        <w:gridCol w:w="792"/>
+        <w:gridCol w:w="792"/>
+        <w:gridCol w:w="792"/>
+        <w:gridCol w:w="792"/>
+        <w:gridCol w:w="792"/>
+        <w:gridCol w:w="792"/>
+        <w:gridCol w:w="792"/>
       </w:tblGrid>
       <w:tr>
         <w:trPr>
@@ -3726,6 +3765,17 @@
               <w:pStyle w:val="Compact"/>
             </w:pPr>
             <w:r>
+              <w:t xml:space="preserve">mdl val</w:t>
+            </w:r>
+          </w:p>
+        </w:tc>
+        <w:tc>
+          <w:tcPr/>
+          <w:p>
+            <w:pPr>
+              <w:pStyle w:val="Compact"/>
+            </w:pPr>
+            <w:r>
               <w:t xml:space="preserve">techops</w:t>
             </w:r>
           </w:p>
@@ -3831,6 +3881,17 @@
             </w:r>
           </w:p>
         </w:tc>
+        <w:tc>
+          <w:tcPr/>
+          <w:p>
+            <w:pPr>
+              <w:pStyle w:val="Compact"/>
+            </w:pPr>
+            <w:r>
+              <w:t xml:space="preserve">R</w:t>
+            </w:r>
+          </w:p>
+        </w:tc>
       </w:tr>
       <w:tr>
         <w:tc>
@@ -3923,6 +3984,17 @@
             </w:r>
           </w:p>
         </w:tc>
+        <w:tc>
+          <w:tcPr/>
+          <w:p>
+            <w:pPr>
+              <w:pStyle w:val="Compact"/>
+            </w:pPr>
+            <w:r>
+              <w:t xml:space="preserve">R</w:t>
+            </w:r>
+          </w:p>
+        </w:tc>
       </w:tr>
       <w:tr>
         <w:tc>
@@ -4024,6 +4096,17 @@
             </w:r>
           </w:p>
         </w:tc>
+        <w:tc>
+          <w:tcPr/>
+          <w:p>
+            <w:pPr>
+              <w:pStyle w:val="Compact"/>
+            </w:pPr>
+            <w:r>
+              <w:t xml:space="preserve">R</w:t>
+            </w:r>
+          </w:p>
+        </w:tc>
       </w:tr>
       <w:tr>
         <w:tc>
@@ -4125,6 +4208,17 @@
             </w:r>
           </w:p>
         </w:tc>
+        <w:tc>
+          <w:tcPr/>
+          <w:p>
+            <w:pPr>
+              <w:pStyle w:val="Compact"/>
+            </w:pPr>
+            <w:r>
+              <w:t xml:space="preserve">R</w:t>
+            </w:r>
+          </w:p>
+        </w:tc>
       </w:tr>
       <w:tr>
         <w:tc>
@@ -4223,6 +4317,17 @@
             </w:r>
           </w:p>
         </w:tc>
+        <w:tc>
+          <w:tcPr/>
+          <w:p>
+            <w:pPr>
+              <w:pStyle w:val="Compact"/>
+            </w:pPr>
+            <w:r>
+              <w:t xml:space="preserve">R</w:t>
+            </w:r>
+          </w:p>
+        </w:tc>
       </w:tr>
       <w:tr>
         <w:tc>
@@ -4321,6 +4426,17 @@
             </w:r>
           </w:p>
         </w:tc>
+        <w:tc>
+          <w:tcPr/>
+          <w:p>
+            <w:pPr>
+              <w:pStyle w:val="Compact"/>
+            </w:pPr>
+            <w:r>
+              <w:t xml:space="preserve">R</w:t>
+            </w:r>
+          </w:p>
+        </w:tc>
       </w:tr>
       <w:tr>
         <w:tc>
@@ -4419,6 +4535,17 @@
             </w:r>
           </w:p>
         </w:tc>
+        <w:tc>
+          <w:tcPr/>
+          <w:p>
+            <w:pPr>
+              <w:pStyle w:val="Compact"/>
+            </w:pPr>
+            <w:r>
+              <w:t xml:space="preserve">R</w:t>
+            </w:r>
+          </w:p>
+        </w:tc>
       </w:tr>
       <w:tr>
         <w:tc>
@@ -4514,6 +4641,17 @@
             </w:r>
           </w:p>
         </w:tc>
+        <w:tc>
+          <w:tcPr/>
+          <w:p>
+            <w:pPr>
+              <w:pStyle w:val="Compact"/>
+            </w:pPr>
+            <w:r>
+              <w:t xml:space="preserve">R</w:t>
+            </w:r>
+          </w:p>
+        </w:tc>
       </w:tr>
       <w:tr>
         <w:tc>
@@ -4609,6 +4747,17 @@
             </w:r>
           </w:p>
         </w:tc>
+        <w:tc>
+          <w:tcPr/>
+          <w:p>
+            <w:pPr>
+              <w:pStyle w:val="Compact"/>
+            </w:pPr>
+            <w:r>
+              <w:t xml:space="preserve">R</w:t>
+            </w:r>
+          </w:p>
+        </w:tc>
       </w:tr>
       <w:tr>
         <w:tc>
@@ -4687,6 +4836,14 @@
             <w:pPr>
               <w:pStyle w:val="Compact"/>
             </w:pPr>
+          </w:p>
+        </w:tc>
+        <w:tc>
+          <w:tcPr/>
+          <w:p>
+            <w:pPr>
+              <w:pStyle w:val="Compact"/>
+            </w:pPr>
             <w:r>
               <w:t xml:space="preserve">R</w:t>
             </w:r>
@@ -4772,6 +4929,14 @@
             </w:pPr>
           </w:p>
         </w:tc>
+        <w:tc>
+          <w:tcPr/>
+          <w:p>
+            <w:pPr>
+              <w:pStyle w:val="Compact"/>
+            </w:pPr>
+          </w:p>
+        </w:tc>
       </w:tr>
       <w:tr>
         <w:tc>
@@ -4852,6 +5017,14 @@
             </w:pPr>
           </w:p>
         </w:tc>
+        <w:tc>
+          <w:tcPr/>
+          <w:p>
+            <w:pPr>
+              <w:pStyle w:val="Compact"/>
+            </w:pPr>
+          </w:p>
+        </w:tc>
       </w:tr>
       <w:tr>
         <w:tc>
@@ -4949,12 +5122,82 @@
               <w:pStyle w:val="Compact"/>
             </w:pPr>
             <w:r>
+              <w:t xml:space="preserve">R own</w:t>
+            </w:r>
+          </w:p>
+        </w:tc>
+        <w:tc>
+          <w:tcPr/>
+          <w:p>
+            <w:pPr>
+              <w:pStyle w:val="Compact"/>
+            </w:pPr>
+            <w:r>
               <w:t xml:space="preserve">CRU</w:t>
             </w:r>
           </w:p>
         </w:tc>
       </w:tr>
     </w:tbl>
+    <w:p>
+      <w:pPr>
+        <w:pStyle w:val="BodyText"/>
+      </w:pPr>
+      <w:r>
+        <w:rPr>
+          <w:i/>
+          <w:iCs/>
+        </w:rPr>
+        <w:t xml:space="preserve">Revision 2.8:</w:t>
+      </w:r>
+      <w:r>
+        <w:t xml:space="preserve"> </w:t>
+      </w:r>
+      <w:r>
+        <w:t xml:space="preserve">a ninth role,</w:t>
+      </w:r>
+      <w:r>
+        <w:t xml:space="preserve"> </w:t>
+      </w:r>
+      <w:r>
+        <w:rPr>
+          <w:rStyle w:val="VerbatimChar"/>
+          <w:b/>
+          <w:bCs/>
+        </w:rPr>
+        <w:t xml:space="preserve">model_validator</w:t>
+      </w:r>
+      <w:r>
+        <w:t xml:space="preserve">, for independent validation: it reads everything a model rests on, raises findings and records periodic reviews, and approves nothing. Recording a periodic review — which lifts the suspensions an overdue review caused — now needs</w:t>
+      </w:r>
+      <w:r>
+        <w:t xml:space="preserve"> </w:t>
+      </w:r>
+      <w:r>
+        <w:rPr>
+          <w:rStyle w:val="VerbatimChar"/>
+        </w:rPr>
+        <w:t xml:space="preserve">model_manager</w:t>
+      </w:r>
+      <w:r>
+        <w:t xml:space="preserve"> </w:t>
+      </w:r>
+      <w:r>
+        <w:t xml:space="preserve">or</w:t>
+      </w:r>
+      <w:r>
+        <w:t xml:space="preserve"> </w:t>
+      </w:r>
+      <w:r>
+        <w:rPr>
+          <w:rStyle w:val="VerbatimChar"/>
+        </w:rPr>
+        <w:t xml:space="preserve">model_validator</w:t>
+      </w:r>
+      <w:r>
+        <w:t xml:space="preserve">, never the model’s owner; reading the model is no longer enough.</w:t>
+      </w:r>
+    </w:p>
     <w:p>
       <w:pPr>
         <w:pStyle w:val="BodyText"/>
@@ -44214,7 +44457,7 @@
         <w:t xml:space="preserve"> </w:t>
       </w:r>
       <w:r>
-        <w:t xml:space="preserve">(3 roles),</w:t>
+        <w:t xml:space="preserve">(4 roles),</w:t>
       </w:r>
       <w:r>
         <w:t xml:space="preserve"> </w:t>
@@ -44230,7 +44473,7 @@
         <w:t xml:space="preserve"> </w:t>
       </w:r>
       <w:r>
-        <w:t xml:space="preserve">(6) or</w:t>
+        <w:t xml:space="preserve">(all, two-person) or</w:t>
       </w:r>
       <w:r>
         <w:t xml:space="preserve"> </w:t>
@@ -44246,7 +44489,7 @@
         <w:t xml:space="preserve"> </w:t>
       </w:r>
       <w:r>
-        <w:t xml:space="preserve">(all 8, strict) (§28.9). All three ship; the question is what the seeded</w:t>
+        <w:t xml:space="preserve">(all, strict) (§28.9). All three ship; the question is what the seeded</w:t>
       </w:r>
       <w:r>
         <w:t xml:space="preserve"> </w:t>
@@ -47591,7 +47834,7 @@
         <w:t xml:space="preserve"> </w:t>
       </w:r>
       <w:r>
-        <w:t xml:space="preserve">(three roles),</w:t>
+        <w:t xml:space="preserve">(four roles),</w:t>
       </w:r>
       <w:r>
         <w:t xml:space="preserve"> </w:t>
@@ -47607,7 +47850,7 @@
         <w:t xml:space="preserve"> </w:t>
       </w:r>
       <w:r>
-        <w:t xml:space="preserve">(six),</w:t>
+        <w:t xml:space="preserve">(every role, two-person SoD),</w:t>
       </w:r>
       <w:r>
         <w:t xml:space="preserve"> </w:t>
@@ -47623,7 +47866,7 @@
         <w:t xml:space="preserve"> </w:t>
       </w:r>
       <w:r>
-        <w:t xml:space="preserve">(all eight, strict SoD) — chosen at namespace creation and changeable. SoD strictness is a namespace setting with</w:t>
+        <w:t xml:space="preserve">(every role, strict SoD) — chosen at namespace creation and changeable. SoD strictness is a namespace setting with</w:t>
       </w:r>
       <w:r>
         <w:t xml:space="preserve"> </w:t>

</xml_diff>

<commit_message>
Administrators may record periodic reviews too (never of a model they own)
</commit_message>
<xml_diff>
--- a/docs/MAYA_Requirements_and_Design.docx
+++ b/docs/MAYA_Requirements_and_Design.docx
@@ -5180,6 +5180,18 @@
         <w:t xml:space="preserve">model_manager</w:t>
       </w:r>
       <w:r>
+        <w:t xml:space="preserve">,</w:t>
+      </w:r>
+      <w:r>
+        <w:t xml:space="preserve"> </w:t>
+      </w:r>
+      <w:r>
+        <w:rPr>
+          <w:rStyle w:val="VerbatimChar"/>
+        </w:rPr>
+        <w:t xml:space="preserve">model_validator</w:t>
+      </w:r>
+      <w:r>
         <w:t xml:space="preserve"> </w:t>
       </w:r>
       <w:r>
@@ -5192,7 +5204,7 @@
         <w:rPr>
           <w:rStyle w:val="VerbatimChar"/>
         </w:rPr>
-        <w:t xml:space="preserve">model_validator</w:t>
+        <w:t xml:space="preserve">admin</w:t>
       </w:r>
       <w:r>
         <w:t xml:space="preserve">, never the model’s owner; reading the model is no longer enough.</w:t>

</xml_diff>

<commit_message>
Every configuration file is YAML read through the configurator: profiles, tiering questionnaire and default policies via Settings.load_yaml (the configurator's new YAML loader), so placeholders resolve; SDK profiles move to ~/.maya/config.yaml, read by the SDK itself, with the old TOML still accepted
</commit_message>
<xml_diff>
--- a/docs/MAYA_Requirements_and_Design.docx
+++ b/docs/MAYA_Requirements_and_Design.docx
@@ -32743,7 +32743,7 @@
         <w:rPr>
           <w:rStyle w:val="VerbatimChar"/>
         </w:rPr>
-        <w:t xml:space="preserve">~/.maya/config.toml</w:t>
+        <w:t xml:space="preserve">~/.maya/config.yaml</w:t>
       </w:r>
       <w:r>
         <w:t xml:space="preserve"> </w:t>
@@ -32760,41 +32760,68 @@
         <w:rPr>
           <w:rStyle w:val="CommentTok"/>
         </w:rPr>
-        <w:t xml:space="preserve"># ~/.maya/config.toml</w:t>
+        <w:t xml:space="preserve"># ~/.maya/config.yaml  (Revision 2.8: YAML, like every MAYA configuration file)</w:t>
       </w:r>
       <w:r>
         <w:br/>
       </w:r>
       <w:r>
         <w:rPr>
+          <w:rStyle w:val="FunctionTok"/>
+        </w:rPr>
+        <w:t xml:space="preserve">profiles</w:t>
+      </w:r>
+      <w:r>
+        <w:rPr>
           <w:rStyle w:val="KeywordTok"/>
         </w:rPr>
-        <w:t xml:space="preserve">[profiles.prod]</w:t>
+        <w:t xml:space="preserve">:</w:t>
       </w:r>
       <w:r>
         <w:br/>
       </w:r>
       <w:r>
         <w:rPr>
-          <w:rStyle w:val="DataTypeTok"/>
+          <w:rStyle w:val="AttributeTok"/>
+        </w:rPr>
+        <w:t xml:space="preserve">  </w:t>
+      </w:r>
+      <w:r>
+        <w:rPr>
+          <w:rStyle w:val="FunctionTok"/>
+        </w:rPr>
+        <w:t xml:space="preserve">prod</w:t>
+      </w:r>
+      <w:r>
+        <w:rPr>
+          <w:rStyle w:val="KeywordTok"/>
+        </w:rPr>
+        <w:t xml:space="preserve">:</w:t>
+      </w:r>
+      <w:r>
+        <w:br/>
+      </w:r>
+      <w:r>
+        <w:rPr>
+          <w:rStyle w:val="AttributeTok"/>
+        </w:rPr>
+        <w:t xml:space="preserve">    </w:t>
+      </w:r>
+      <w:r>
+        <w:rPr>
+          <w:rStyle w:val="FunctionTok"/>
         </w:rPr>
         <w:t xml:space="preserve">base_url</w:t>
       </w:r>
       <w:r>
         <w:rPr>
-          <w:rStyle w:val="NormalTok"/>
-        </w:rPr>
-        <w:t xml:space="preserve"> </w:t>
-      </w:r>
-      <w:r>
-        <w:rPr>
-          <w:rStyle w:val="OperatorTok"/>
-        </w:rPr>
-        <w:t xml:space="preserve">=</w:t>
-      </w:r>
-      <w:r>
-        <w:rPr>
-          <w:rStyle w:val="NormalTok"/>
+          <w:rStyle w:val="KeywordTok"/>
+        </w:rPr>
+        <w:t xml:space="preserve">:</w:t>
+      </w:r>
+      <w:r>
+        <w:rPr>
+          <w:rStyle w:val="AttributeTok"/>
         </w:rPr>
         <w:t xml:space="preserve"> </w:t>
       </w:r>
@@ -32809,111 +32836,87 @@
       </w:r>
       <w:r>
         <w:rPr>
-          <w:rStyle w:val="DataTypeTok"/>
+          <w:rStyle w:val="AttributeTok"/>
+        </w:rPr>
+        <w:t xml:space="preserve">    </w:t>
+      </w:r>
+      <w:r>
+        <w:rPr>
+          <w:rStyle w:val="FunctionTok"/>
         </w:rPr>
         <w:t xml:space="preserve">api_key_env</w:t>
       </w:r>
       <w:r>
         <w:rPr>
-          <w:rStyle w:val="NormalTok"/>
-        </w:rPr>
-        <w:t xml:space="preserve"> </w:t>
-      </w:r>
-      <w:r>
-        <w:rPr>
-          <w:rStyle w:val="OperatorTok"/>
-        </w:rPr>
-        <w:t xml:space="preserve">=</w:t>
-      </w:r>
-      <w:r>
-        <w:rPr>
-          <w:rStyle w:val="NormalTok"/>
-        </w:rPr>
-        <w:t xml:space="preserve"> </w:t>
-      </w:r>
-      <w:r>
-        <w:rPr>
-          <w:rStyle w:val="StringTok"/>
-        </w:rPr>
-        <w:t xml:space="preserve">"MAYA_API_KEY_PROD"</w:t>
-      </w:r>
-      <w:r>
-        <w:rPr>
-          <w:rStyle w:val="NormalTok"/>
-        </w:rPr>
-        <w:t xml:space="preserve">   </w:t>
+          <w:rStyle w:val="KeywordTok"/>
+        </w:rPr>
+        <w:t xml:space="preserve">:</w:t>
+      </w:r>
+      <w:r>
+        <w:rPr>
+          <w:rStyle w:val="AttributeTok"/>
+        </w:rPr>
+        <w:t xml:space="preserve"> MAYA_API_KEY_PROD</w:t>
       </w:r>
       <w:r>
         <w:rPr>
           <w:rStyle w:val="CommentTok"/>
         </w:rPr>
-        <w:t xml:space="preserve"># never the secret itself, only where to find it</w:t>
+        <w:t xml:space="preserve">   # never the secret itself, only where to find it</w:t>
       </w:r>
       <w:r>
         <w:br/>
       </w:r>
       <w:r>
         <w:rPr>
-          <w:rStyle w:val="DataTypeTok"/>
+          <w:rStyle w:val="AttributeTok"/>
+        </w:rPr>
+        <w:t xml:space="preserve">    </w:t>
+      </w:r>
+      <w:r>
+        <w:rPr>
+          <w:rStyle w:val="FunctionTok"/>
         </w:rPr>
         <w:t xml:space="preserve">default_namespace</w:t>
       </w:r>
       <w:r>
         <w:rPr>
-          <w:rStyle w:val="NormalTok"/>
-        </w:rPr>
-        <w:t xml:space="preserve"> </w:t>
-      </w:r>
-      <w:r>
-        <w:rPr>
-          <w:rStyle w:val="OperatorTok"/>
-        </w:rPr>
-        <w:t xml:space="preserve">=</w:t>
-      </w:r>
-      <w:r>
-        <w:rPr>
-          <w:rStyle w:val="NormalTok"/>
-        </w:rPr>
-        <w:t xml:space="preserve"> </w:t>
-      </w:r>
-      <w:r>
-        <w:rPr>
-          <w:rStyle w:val="StringTok"/>
-        </w:rPr>
-        <w:t xml:space="preserve">"equity.pricing"</w:t>
+          <w:rStyle w:val="KeywordTok"/>
+        </w:rPr>
+        <w:t xml:space="preserve">:</w:t>
+      </w:r>
+      <w:r>
+        <w:rPr>
+          <w:rStyle w:val="AttributeTok"/>
+        </w:rPr>
+        <w:t xml:space="preserve"> equity.pricing</w:t>
       </w:r>
       <w:r>
         <w:br/>
       </w:r>
       <w:r>
         <w:rPr>
-          <w:rStyle w:val="DataTypeTok"/>
+          <w:rStyle w:val="AttributeTok"/>
+        </w:rPr>
+        <w:t xml:space="preserve">    </w:t>
+      </w:r>
+      <w:r>
+        <w:rPr>
+          <w:rStyle w:val="FunctionTok"/>
         </w:rPr>
         <w:t xml:space="preserve">cache_dir</w:t>
       </w:r>
       <w:r>
         <w:rPr>
-          <w:rStyle w:val="NormalTok"/>
-        </w:rPr>
-        <w:t xml:space="preserve"> </w:t>
-      </w:r>
-      <w:r>
-        <w:rPr>
-          <w:rStyle w:val="OperatorTok"/>
-        </w:rPr>
-        <w:t xml:space="preserve">=</w:t>
-      </w:r>
-      <w:r>
-        <w:rPr>
-          <w:rStyle w:val="NormalTok"/>
-        </w:rPr>
-        <w:t xml:space="preserve"> </w:t>
-      </w:r>
-      <w:r>
-        <w:rPr>
-          <w:rStyle w:val="StringTok"/>
-        </w:rPr>
-        <w:t xml:space="preserve">"~/.maya/cache"</w:t>
+          <w:rStyle w:val="KeywordTok"/>
+        </w:rPr>
+        <w:t xml:space="preserve">:</w:t>
+      </w:r>
+      <w:r>
+        <w:rPr>
+          <w:rStyle w:val="AttributeTok"/>
+        </w:rPr>
+        <w:t xml:space="preserve"> ~/.maya/cache</w:t>
       </w:r>
     </w:p>
     <w:p>

</xml_diff>

<commit_message>
The SDK stands alone as maya-sdk: shared errors, hashing, archives and the formula IR and evaluator live in maya/sdk/_shared with the server's old names as aliases; maya is a namespace package; tools/ops/build_sdk.py builds the wheel; a test proves the SDK works with the rest of MAYA blocked and from the wheel alone. LlmUnavailable is a shared error; case study 49 says why its live Azure run is refused
</commit_message>
<xml_diff>
--- a/docs/MAYA_Requirements_and_Design.docx
+++ b/docs/MAYA_Requirements_and_Design.docx
@@ -32346,6 +32346,127 @@
       </w:r>
       <w:r>
         <w:t xml:space="preserve">, used by the web UI, the CLI, notebooks, schedulers and CI alike. A capability that is not in the SDK does not exist for anyone, including our own UI, so API completeness and SDK completeness are the same problem and cannot drift apart.</w:t>
+      </w:r>
+    </w:p>
+    <w:p>
+      <w:pPr>
+        <w:pStyle w:val="BodyText"/>
+      </w:pPr>
+      <w:r>
+        <w:rPr>
+          <w:i/>
+          <w:iCs/>
+        </w:rPr>
+        <w:t xml:space="preserve">Revision 2.8:</w:t>
+      </w:r>
+      <w:r>
+        <w:t xml:space="preserve"> </w:t>
+      </w:r>
+      <w:r>
+        <w:rPr>
+          <w:b/>
+          <w:bCs/>
+        </w:rPr>
+        <w:t xml:space="preserve">the SDK stands alone.</w:t>
+      </w:r>
+      <w:r>
+        <w:t xml:space="preserve"> </w:t>
+      </w:r>
+      <w:r>
+        <w:t xml:space="preserve">End users install it without the rest of MAYA, as its own distribution,</w:t>
+      </w:r>
+      <w:r>
+        <w:t xml:space="preserve"> </w:t>
+      </w:r>
+      <w:r>
+        <w:rPr>
+          <w:rStyle w:val="VerbatimChar"/>
+        </w:rPr>
+        <w:t xml:space="preserve">maya-sdk</w:t>
+      </w:r>
+      <w:r>
+        <w:t xml:space="preserve"> </w:t>
+      </w:r>
+      <w:r>
+        <w:t xml:space="preserve">(built by</w:t>
+      </w:r>
+      <w:r>
+        <w:t xml:space="preserve"> </w:t>
+      </w:r>
+      <w:r>
+        <w:rPr>
+          <w:rStyle w:val="VerbatimChar"/>
+        </w:rPr>
+        <w:t xml:space="preserve">tools/ops/build_sdk.py</w:t>
+      </w:r>
+      <w:r>
+        <w:t xml:space="preserve">; dependencies httpx, PyYAML, pyarrow and numpy, extras</w:t>
+      </w:r>
+      <w:r>
+        <w:t xml:space="preserve"> </w:t>
+      </w:r>
+      <w:r>
+        <w:rPr>
+          <w:rStyle w:val="VerbatimChar"/>
+        </w:rPr>
+        <w:t xml:space="preserve">offline</w:t>
+      </w:r>
+      <w:r>
+        <w:t xml:space="preserve"> </w:t>
+      </w:r>
+      <w:r>
+        <w:t xml:space="preserve">and</w:t>
+      </w:r>
+      <w:r>
+        <w:t xml:space="preserve"> </w:t>
+      </w:r>
+      <w:r>
+        <w:rPr>
+          <w:rStyle w:val="VerbatimChar"/>
+        </w:rPr>
+        <w:t xml:space="preserve">polars</w:t>
+      </w:r>
+      <w:r>
+        <w:t xml:space="preserve">). It imports nothing from MAYA outside</w:t>
+      </w:r>
+      <w:r>
+        <w:t xml:space="preserve"> </w:t>
+      </w:r>
+      <w:r>
+        <w:rPr>
+          <w:rStyle w:val="VerbatimChar"/>
+        </w:rPr>
+        <w:t xml:space="preserve">maya.sdk</w:t>
+      </w:r>
+      <w:r>
+        <w:t xml:space="preserve">. What both sides must share exactly — the error classes, canonical content hashing, archive reading, and the formula IR, composites and evaluator that score a bundle offline — lives once, in</w:t>
+      </w:r>
+      <w:r>
+        <w:t xml:space="preserve"> </w:t>
+      </w:r>
+      <w:r>
+        <w:rPr>
+          <w:rStyle w:val="VerbatimChar"/>
+        </w:rPr>
+        <w:t xml:space="preserve">maya/sdk/_shared/</w:t>
+      </w:r>
+      <w:r>
+        <w:t xml:space="preserve">, and the server’s old module names are aliases of those modules rather than copies.</w:t>
+      </w:r>
+      <w:r>
+        <w:t xml:space="preserve"> </w:t>
+      </w:r>
+      <w:r>
+        <w:rPr>
+          <w:rStyle w:val="VerbatimChar"/>
+        </w:rPr>
+        <w:t xml:space="preserve">maya</w:t>
+      </w:r>
+      <w:r>
+        <w:t xml:space="preserve"> </w:t>
+      </w:r>
+      <w:r>
+        <w:t xml:space="preserve">is a namespace package so the SDK wheel installs on its own. A test imports and uses the SDK with every other part of MAYA blocked, and again from the built wheel alone.</w:t>
       </w:r>
     </w:p>
     <w:bookmarkStart w:id="114" w:name="principles"/>

</xml_diff>

<commit_message>
The SDK is its own project: sdk/ with its own pyproject, version, README and licence, built as maya-sdk; the server package excludes it and depends on maya-sdk; gates cover sdk/; tests prove the SDK wheel works alone and the server wheel carries no SDK code
</commit_message>
<xml_diff>
--- a/docs/MAYA_Requirements_and_Design.docx
+++ b/docs/MAYA_Requirements_and_Design.docx
@@ -32373,7 +32373,34 @@
         <w:t xml:space="preserve"> </w:t>
       </w:r>
       <w:r>
-        <w:t xml:space="preserve">End users install it without the rest of MAYA, as its own distribution,</w:t>
+        <w:t xml:space="preserve">It is its own project (</w:t>
+      </w:r>
+      <w:r>
+        <w:rPr>
+          <w:rStyle w:val="VerbatimChar"/>
+        </w:rPr>
+        <w:t xml:space="preserve">sdk/</w:t>
+      </w:r>
+      <w:r>
+        <w:t xml:space="preserve"> </w:t>
+      </w:r>
+      <w:r>
+        <w:t xml:space="preserve">in the repository, with its own</w:t>
+      </w:r>
+      <w:r>
+        <w:t xml:space="preserve"> </w:t>
+      </w:r>
+      <w:r>
+        <w:rPr>
+          <w:rStyle w:val="VerbatimChar"/>
+        </w:rPr>
+        <w:t xml:space="preserve">pyproject.toml</w:t>
+      </w:r>
+      <w:r>
+        <w:t xml:space="preserve"> </w:t>
+      </w:r>
+      <w:r>
+        <w:t xml:space="preserve">and version) and its own distribution,</w:t>
       </w:r>
       <w:r>
         <w:t xml:space="preserve"> </w:t>
@@ -32388,19 +32415,7 @@
         <w:t xml:space="preserve"> </w:t>
       </w:r>
       <w:r>
-        <w:t xml:space="preserve">(built by</w:t>
-      </w:r>
-      <w:r>
-        <w:t xml:space="preserve"> </w:t>
-      </w:r>
-      <w:r>
-        <w:rPr>
-          <w:rStyle w:val="VerbatimChar"/>
-        </w:rPr>
-        <w:t xml:space="preserve">tools/ops/build_sdk.py</w:t>
-      </w:r>
-      <w:r>
-        <w:t xml:space="preserve">; dependencies httpx, PyYAML, pyarrow and numpy, extras</w:t>
+        <w:t xml:space="preserve">(dependencies httpx, PyYAML, pyarrow and numpy; extras</w:t>
       </w:r>
       <w:r>
         <w:t xml:space="preserve"> </w:t>
@@ -32427,7 +32442,22 @@
         <w:t xml:space="preserve">polars</w:t>
       </w:r>
       <w:r>
-        <w:t xml:space="preserve">). It imports nothing from MAYA outside</w:t>
+        <w:t xml:space="preserve">). End users install only it. The server’s package excludes it and declares</w:t>
+      </w:r>
+      <w:r>
+        <w:t xml:space="preserve"> </w:t>
+      </w:r>
+      <w:r>
+        <w:rPr>
+          <w:rStyle w:val="VerbatimChar"/>
+        </w:rPr>
+        <w:t xml:space="preserve">maya-sdk</w:t>
+      </w:r>
+      <w:r>
+        <w:t xml:space="preserve"> </w:t>
+      </w:r>
+      <w:r>
+        <w:t xml:space="preserve">as a dependency, like any client. It imports nothing from MAYA outside</w:t>
       </w:r>
       <w:r>
         <w:t xml:space="preserve"> </w:t>
@@ -32466,7 +32496,19 @@
         <w:t xml:space="preserve"> </w:t>
       </w:r>
       <w:r>
-        <w:t xml:space="preserve">is a namespace package so the SDK wheel installs on its own. A test imports and uses the SDK with every other part of MAYA blocked, and again from the built wheel alone.</w:t>
+        <w:t xml:space="preserve">is a namespace package so the SDK wheel installs on its own. Tests import and use the SDK with every other part of MAYA blocked, and again from its built wheel alone; and check that the server’s wheel contains no SDK code and requires</w:t>
+      </w:r>
+      <w:r>
+        <w:t xml:space="preserve"> </w:t>
+      </w:r>
+      <w:r>
+        <w:rPr>
+          <w:rStyle w:val="VerbatimChar"/>
+        </w:rPr>
+        <w:t xml:space="preserve">maya-sdk</w:t>
+      </w:r>
+      <w:r>
+        <w:t xml:space="preserve">.</w:t>
       </w:r>
     </w:p>
     <w:bookmarkStart w:id="114" w:name="principles"/>
@@ -35820,6 +35862,247 @@
       </w:r>
       <w:r>
         <w:t xml:space="preserve">in a constrained environment pulls in almost nothing. It is published as a wheel with a lock file, is installable from a local mirror for air-gapped sites, and follows semantic versioning independently of the server, with a compatibility table in the help pages.</w:t>
+      </w:r>
+    </w:p>
+    <w:p>
+      <w:pPr>
+        <w:pStyle w:val="BodyText"/>
+      </w:pPr>
+      <w:r>
+        <w:rPr>
+          <w:i/>
+          <w:iCs/>
+        </w:rPr>
+        <w:t xml:space="preserve">Revision 2.8:</w:t>
+      </w:r>
+      <w:r>
+        <w:t xml:space="preserve"> </w:t>
+      </w:r>
+      <w:r>
+        <w:t xml:space="preserve">the layout as built. The SDK is its own project beside the server:</w:t>
+      </w:r>
+    </w:p>
+    <w:p>
+      <w:pPr>
+        <w:pStyle w:val="SourceCode"/>
+      </w:pPr>
+      <w:r>
+        <w:rPr>
+          <w:rStyle w:val="VerbatimChar"/>
+        </w:rPr>
+        <w:t xml:space="preserve">sdk/                     # the maya-sdk project: built, versioned and released on its own</w:t>
+      </w:r>
+      <w:r>
+        <w:br/>
+      </w:r>
+      <w:r>
+        <w:rPr>
+          <w:rStyle w:val="VerbatimChar"/>
+        </w:rPr>
+        <w:t xml:space="preserve">  pyproject.toml         # name maya-sdk; httpx, PyYAML, pyarrow, numpy; extras offline, polars</w:t>
+      </w:r>
+      <w:r>
+        <w:br/>
+      </w:r>
+      <w:r>
+        <w:rPr>
+          <w:rStyle w:val="VerbatimChar"/>
+        </w:rPr>
+        <w:t xml:space="preserve">  README.md</w:t>
+      </w:r>
+      <w:r>
+        <w:br/>
+      </w:r>
+      <w:r>
+        <w:rPr>
+          <w:rStyle w:val="VerbatimChar"/>
+        </w:rPr>
+        <w:t xml:space="preserve">  maya/sdk/</w:t>
+      </w:r>
+      <w:r>
+        <w:br/>
+      </w:r>
+      <w:r>
+        <w:rPr>
+          <w:rStyle w:val="VerbatimChar"/>
+        </w:rPr>
+        <w:t xml:space="preserve">    _version.py          # the SDK's own version</w:t>
+      </w:r>
+      <w:r>
+        <w:br/>
+      </w:r>
+      <w:r>
+        <w:rPr>
+          <w:rStyle w:val="VerbatimChar"/>
+        </w:rPr>
+        <w:t xml:space="preserve">    client.py            # Client, AsyncClient, connect(), YAML profiles</w:t>
+      </w:r>
+      <w:r>
+        <w:br/>
+      </w:r>
+      <w:r>
+        <w:rPr>
+          <w:rStyle w:val="VerbatimChar"/>
+        </w:rPr>
+        <w:t xml:space="preserve">    transport.py         # http and inproc (ASGI) transports</w:t>
+      </w:r>
+      <w:r>
+        <w:br/>
+      </w:r>
+      <w:r>
+        <w:rPr>
+          <w:rStyle w:val="VerbatimChar"/>
+        </w:rPr>
+        <w:t xml:space="preserve">    base.py, resources.py, governance.py, llm.py, integrations.py   # the resources</w:t>
+      </w:r>
+      <w:r>
+        <w:br/>
+      </w:r>
+      <w:r>
+        <w:rPr>
+          <w:rStyle w:val="VerbatimChar"/>
+        </w:rPr>
+        <w:t xml:space="preserve">    handles.py, io.py, cache.py, guard.py, trainer.py</w:t>
+      </w:r>
+      <w:r>
+        <w:br/>
+      </w:r>
+      <w:r>
+        <w:rPr>
+          <w:rStyle w:val="VerbatimChar"/>
+        </w:rPr>
+        <w:t xml:space="preserve">    replay.py            # record and replay</w:t>
+      </w:r>
+      <w:r>
+        <w:br/>
+      </w:r>
+      <w:r>
+        <w:rPr>
+          <w:rStyle w:val="VerbatimChar"/>
+        </w:rPr>
+        <w:t xml:space="preserve">    offline.py           # maya.offline(bundle): verify and score with no server</w:t>
+      </w:r>
+      <w:r>
+        <w:br/>
+      </w:r>
+      <w:r>
+        <w:rPr>
+          <w:rStyle w:val="VerbatimChar"/>
+        </w:rPr>
+        <w:t xml:space="preserve">    _shared/             # what the server shares exactly: errors, canonical hashing,</w:t>
+      </w:r>
+      <w:r>
+        <w:br/>
+      </w:r>
+      <w:r>
+        <w:rPr>
+          <w:rStyle w:val="VerbatimChar"/>
+        </w:rPr>
+        <w:t xml:space="preserve">                         # archives, the formula IR, composites and evaluator</w:t>
+      </w:r>
+    </w:p>
+    <w:p>
+      <w:pPr>
+        <w:pStyle w:val="FirstParagraph"/>
+      </w:pPr>
+      <w:r>
+        <w:t xml:space="preserve">The dependencies are</w:t>
+      </w:r>
+      <w:r>
+        <w:t xml:space="preserve"> </w:t>
+      </w:r>
+      <w:r>
+        <w:rPr>
+          <w:rStyle w:val="VerbatimChar"/>
+        </w:rPr>
+        <w:t xml:space="preserve">httpx</w:t>
+      </w:r>
+      <w:r>
+        <w:t xml:space="preserve">,</w:t>
+      </w:r>
+      <w:r>
+        <w:t xml:space="preserve"> </w:t>
+      </w:r>
+      <w:r>
+        <w:rPr>
+          <w:rStyle w:val="VerbatimChar"/>
+        </w:rPr>
+        <w:t xml:space="preserve">PyYAML</w:t>
+      </w:r>
+      <w:r>
+        <w:t xml:space="preserve">,</w:t>
+      </w:r>
+      <w:r>
+        <w:t xml:space="preserve"> </w:t>
+      </w:r>
+      <w:r>
+        <w:rPr>
+          <w:rStyle w:val="VerbatimChar"/>
+        </w:rPr>
+        <w:t xml:space="preserve">pyarrow</w:t>
+      </w:r>
+      <w:r>
+        <w:t xml:space="preserve"> </w:t>
+      </w:r>
+      <w:r>
+        <w:t xml:space="preserve">and</w:t>
+      </w:r>
+      <w:r>
+        <w:t xml:space="preserve"> </w:t>
+      </w:r>
+      <w:r>
+        <w:rPr>
+          <w:rStyle w:val="VerbatimChar"/>
+        </w:rPr>
+        <w:t xml:space="preserve">numpy</w:t>
+      </w:r>
+      <w:r>
+        <w:t xml:space="preserve">, not</w:t>
+      </w:r>
+      <w:r>
+        <w:t xml:space="preserve"> </w:t>
+      </w:r>
+      <w:r>
+        <w:rPr>
+          <w:rStyle w:val="VerbatimChar"/>
+        </w:rPr>
+        <w:t xml:space="preserve">pydantic</w:t>
+      </w:r>
+      <w:r>
+        <w:t xml:space="preserve"> </w:t>
+      </w:r>
+      <w:r>
+        <w:t xml:space="preserve">as planned;</w:t>
+      </w:r>
+      <w:r>
+        <w:t xml:space="preserve"> </w:t>
+      </w:r>
+      <w:r>
+        <w:rPr>
+          <w:rStyle w:val="VerbatimChar"/>
+        </w:rPr>
+        <w:t xml:space="preserve">cryptography</w:t>
+      </w:r>
+      <w:r>
+        <w:t xml:space="preserve"> </w:t>
+      </w:r>
+      <w:r>
+        <w:t xml:space="preserve">(bundle signatures) and</w:t>
+      </w:r>
+      <w:r>
+        <w:t xml:space="preserve"> </w:t>
+      </w:r>
+      <w:r>
+        <w:rPr>
+          <w:rStyle w:val="VerbatimChar"/>
+        </w:rPr>
+        <w:t xml:space="preserve">polars</w:t>
+      </w:r>
+      <w:r>
+        <w:t xml:space="preserve"> </w:t>
+      </w:r>
+      <w:r>
+        <w:t xml:space="preserve">are extras.</w:t>
       </w:r>
     </w:p>
     <w:bookmarkEnd w:id="119"/>

</xml_diff>